<commit_message>
Add the TotalEnergies mission and close Amundi on the CV
TotalEnergies Digital Factory, Senior Full Stack AI Developer (TypeScript /
Python), from November 2026 — kept deliberately light. Amundi ITS now ends
October 2026. Rebuilt every main and np PDF/DOCX, EN and FR; the frontend
variant gets the same entry.

Claude-Session: https://claude.ai/code/session_01G9HeVjSCmghPePaaX2f7Be
</commit_message>
<xml_diff>
--- a/assets/najih-driss-cv-en-short.docx
+++ b/assets/najih-driss-cv-en-short.docx
@@ -313,7 +313,7 @@
           <w:color w:val="000000"/>
           <w:sz w:val="21"/>
         </w:rPr>
-        <w:t xml:space="preserve">Full Stack Developer (Angular / Node.js) — PREESM GROUP</w:t>
+        <w:t xml:space="preserve">Senior Full Stack AI Developer (TypeScript / Python) — TOTALENERGIES</w:t>
       </w:r>
       <w:r>
         <w:rPr>
@@ -326,7 +326,7 @@
           <w:color w:val="555555"/>
           <w:sz w:val="18"/>
         </w:rPr>
-        <w:t xml:space="preserve">May 2026 – Present (6 months)</w:t>
+        <w:t xml:space="preserve">November 2026 – Present (1 month)</w:t>
       </w:r>
     </w:p>
     <w:p>
@@ -339,23 +339,23 @@
       </w:pPr>
       <w:r>
         <w:rPr/>
-        <w:t xml:space="preserve">Created </w:t>
-      </w:r>
-      <w:r>
-        <w:rPr>
-          <w:b/>
-        </w:rPr>
-        <w:t xml:space="preserve">Preesm Portal</w:t>
-      </w:r>
-      <w:r>
-        <w:rPr/>
-        <w:t xml:space="preserve"> end to end — product design, </w:t>
-      </w:r>
-      <w:r>
-        <w:rPr>
-          <w:b/>
-        </w:rPr>
-        <w:t xml:space="preserve">architecture, tech choices and infrastructure</w:t>
+        <w:t xml:space="preserve">Full stack development of </w:t>
+      </w:r>
+      <w:r>
+        <w:rPr>
+          <w:b/>
+        </w:rPr>
+        <w:t xml:space="preserve">AI-powered applications</w:t>
+      </w:r>
+      <w:r>
+        <w:rPr/>
+        <w:t xml:space="preserve">, across </w:t>
+      </w:r>
+      <w:r>
+        <w:rPr>
+          <w:b/>
+        </w:rPr>
+        <w:t xml:space="preserve">back end and front end</w:t>
       </w:r>
     </w:p>
     <w:p>
@@ -368,63 +368,13 @@
       </w:pPr>
       <w:r>
         <w:rPr/>
-        <w:t xml:space="preserve">Delivered the core modules: </w:t>
-      </w:r>
-      <w:r>
-        <w:rPr>
-          <w:b/>
-        </w:rPr>
-        <w:t xml:space="preserve">franchisee onboarding</w:t>
-      </w:r>
-      <w:r>
-        <w:rPr/>
-        <w:t xml:space="preserve">, </w:t>
-      </w:r>
-      <w:r>
-        <w:rPr>
-          <w:b/>
-        </w:rPr>
-        <w:t xml:space="preserve">document generation with e-signature</w:t>
-      </w:r>
-      <w:r>
-        <w:rPr/>
-        <w:t xml:space="preserve">, </w:t>
-      </w:r>
-      <w:r>
-        <w:rPr>
-          <w:b/>
-        </w:rPr>
-        <w:t xml:space="preserve">file deposit</w:t>
-      </w:r>
-      <w:r>
-        <w:rPr/>
-        <w:t xml:space="preserve">, </w:t>
-      </w:r>
-      <w:r>
-        <w:rPr>
-          <w:b/>
-        </w:rPr>
-        <w:t xml:space="preserve">users, roles and access</w:t>
-      </w:r>
-      <w:r>
-        <w:rPr/>
-        <w:t xml:space="preserve">, </w:t>
-      </w:r>
-      <w:r>
-        <w:rPr>
-          <w:b/>
-        </w:rPr>
-        <w:t xml:space="preserve">billing</w:t>
-      </w:r>
-      <w:r>
-        <w:rPr/>
-        <w:t xml:space="preserve">, </w:t>
-      </w:r>
-      <w:r>
-        <w:rPr>
-          <w:b/>
-        </w:rPr>
-        <w:t xml:space="preserve">reporting</w:t>
+        <w:t xml:space="preserve">Services and interfaces built mainly in </w:t>
+      </w:r>
+      <w:r>
+        <w:rPr>
+          <w:b/>
+        </w:rPr>
+        <w:t xml:space="preserve">TypeScript</w:t>
       </w:r>
       <w:r>
         <w:rPr/>
@@ -434,113 +384,7 @@
         <w:rPr>
           <w:b/>
         </w:rPr>
-        <w:t xml:space="preserve">mailing campaigns</w:t>
-      </w:r>
-    </w:p>
-    <w:p>
-      <w:pPr>
-        <w:numPr>
-          <w:ilvl w:val="0"/>
-          <w:numId w:val="1"/>
-        </w:numPr>
-        <w:spacing w:lineRule="auto"/>
-      </w:pPr>
-      <w:r>
-        <w:rPr/>
-        <w:t xml:space="preserve">Produced the </w:t>
-      </w:r>
-      <w:r>
-        <w:rPr>
-          <w:b/>
-        </w:rPr>
-        <w:t xml:space="preserve">mockups and full design proposal</w:t>
-      </w:r>
-      <w:r>
-        <w:rPr/>
-        <w:t xml:space="preserve">, then a fast </w:t>
-      </w:r>
-      <w:r>
-        <w:rPr>
-          <w:b/>
-        </w:rPr>
-        <w:t xml:space="preserve">Angular 22</w:t>
-      </w:r>
-      <w:r>
-        <w:rPr/>
-        <w:t xml:space="preserve"> SPA on </w:t>
-      </w:r>
-      <w:r>
-        <w:rPr>
-          <w:b/>
-        </w:rPr>
-        <w:t xml:space="preserve">@kouji-ui</w:t>
-      </w:r>
-      <w:r>
-        <w:rPr/>
-        <w:t xml:space="preserve">, my own public library, with a </w:t>
-      </w:r>
-      <w:r>
-        <w:rPr>
-          <w:b/>
-        </w:rPr>
-        <w:t xml:space="preserve">Hono/Node.js</w:t>
-      </w:r>
-      <w:r>
-        <w:rPr/>
-        <w:t xml:space="preserve"> API and PostgreSQL</w:t>
-      </w:r>
-    </w:p>
-    <w:p>
-      <w:pPr>
-        <w:numPr>
-          <w:ilvl w:val="0"/>
-          <w:numId w:val="1"/>
-        </w:numPr>
-        <w:spacing w:lineRule="auto"/>
-      </w:pPr>
-      <w:r>
-        <w:rPr/>
-        <w:t xml:space="preserve">Secured the platform (</w:t>
-      </w:r>
-      <w:r>
-        <w:rPr>
-          <w:b/>
-        </w:rPr>
-        <w:t xml:space="preserve">passkey/MFA</w:t>
-      </w:r>
-      <w:r>
-        <w:rPr/>
-        <w:t xml:space="preserve">, </w:t>
-      </w:r>
-      <w:r>
-        <w:rPr>
-          <w:b/>
-        </w:rPr>
-        <w:t xml:space="preserve">deny-by-default RBAC</w:t>
-      </w:r>
-      <w:r>
-        <w:rPr/>
-        <w:t xml:space="preserve">) and shipped to </w:t>
-      </w:r>
-      <w:r>
-        <w:rPr>
-          <w:b/>
-        </w:rPr>
-        <w:t xml:space="preserve">staging and production</w:t>
-      </w:r>
-      <w:r>
-        <w:rPr/>
-        <w:t xml:space="preserve"> with </w:t>
-      </w:r>
-      <w:r>
-        <w:rPr>
-          <w:b/>
-        </w:rPr>
-        <w:t xml:space="preserve">Playwright E2E tests</w:t>
-      </w:r>
-      <w:r>
-        <w:rPr/>
-        <w:t xml:space="preserve"> and quality gates</w:t>
+        <w:t xml:space="preserve">Python</w:t>
       </w:r>
     </w:p>
     <w:p>
@@ -560,7 +404,7 @@
           <w:color w:val="444444"/>
           <w:sz w:val="18"/>
         </w:rPr>
-        <w:t xml:space="preserve"> Angular 22 (zoneless, signals), kouji-ui, TypeScript, Tailwind CSS 4, Node.js, Hono, BetterAuth (passkeys, TOTP), Zod, Brevo, PostgreSQL 17, Drizzle ORM, Supabase, Vitest, Playwright, Docker, GitHub Actions, Render, OVH, Caddy, pgBackRest</w:t>
+        <w:t xml:space="preserve"> TypeScript, Python, Angular, Node.js, Git, GitHub, GitHub Actions</w:t>
       </w:r>
     </w:p>
     <w:p>
@@ -573,7 +417,7 @@
           <w:color w:val="000000"/>
           <w:sz w:val="21"/>
         </w:rPr>
-        <w:t xml:space="preserve">Senior Full Stack Developer (Angular / Java) — AMUNDI ITS</w:t>
+        <w:t xml:space="preserve">Full Stack Developer (Angular / Node.js) — PREESM GROUP</w:t>
       </w:r>
       <w:r>
         <w:rPr>
@@ -586,7 +430,7 @@
           <w:color w:val="555555"/>
           <w:sz w:val="18"/>
         </w:rPr>
-        <w:t xml:space="preserve">September 2023 – Present (3 years 2 months)</w:t>
+        <w:t xml:space="preserve">May 2026 – Present (6 months)</w:t>
       </w:r>
     </w:p>
     <w:p>
@@ -599,17 +443,23 @@
       </w:pPr>
       <w:r>
         <w:rPr/>
-        <w:t xml:space="preserve">Maintained and evolved the </w:t>
-      </w:r>
-      <w:r>
-        <w:rPr>
-          <w:b/>
-        </w:rPr>
-        <w:t xml:space="preserve">Maestro Angular framework</w:t>
-      </w:r>
-      <w:r>
-        <w:rPr/>
-        <w:t xml:space="preserve"> used by multiple internal and client-facing applications</w:t>
+        <w:t xml:space="preserve">Created </w:t>
+      </w:r>
+      <w:r>
+        <w:rPr>
+          <w:b/>
+        </w:rPr>
+        <w:t xml:space="preserve">Preesm Portal</w:t>
+      </w:r>
+      <w:r>
+        <w:rPr/>
+        <w:t xml:space="preserve"> end to end — product design, </w:t>
+      </w:r>
+      <w:r>
+        <w:rPr>
+          <w:b/>
+        </w:rPr>
+        <w:t xml:space="preserve">architecture, tech choices and infrastructure</w:t>
       </w:r>
     </w:p>
     <w:p>
@@ -622,17 +472,73 @@
       </w:pPr>
       <w:r>
         <w:rPr/>
-        <w:t xml:space="preserve">Actively participated in </w:t>
-      </w:r>
-      <w:r>
-        <w:rPr>
-          <w:b/>
-        </w:rPr>
-        <w:t xml:space="preserve">major Angular version migrations (15 → 18 → 20)</w:t>
-      </w:r>
-      <w:r>
-        <w:rPr/>
-        <w:t xml:space="preserve">, including component upgrades, dependency updates, and adoption of new framework capabilities (Signals, Standalone Components, etc.)</w:t>
+        <w:t xml:space="preserve">Delivered the core modules: </w:t>
+      </w:r>
+      <w:r>
+        <w:rPr>
+          <w:b/>
+        </w:rPr>
+        <w:t xml:space="preserve">franchisee onboarding</w:t>
+      </w:r>
+      <w:r>
+        <w:rPr/>
+        <w:t xml:space="preserve">, </w:t>
+      </w:r>
+      <w:r>
+        <w:rPr>
+          <w:b/>
+        </w:rPr>
+        <w:t xml:space="preserve">document generation with e-signature</w:t>
+      </w:r>
+      <w:r>
+        <w:rPr/>
+        <w:t xml:space="preserve">, </w:t>
+      </w:r>
+      <w:r>
+        <w:rPr>
+          <w:b/>
+        </w:rPr>
+        <w:t xml:space="preserve">file deposit</w:t>
+      </w:r>
+      <w:r>
+        <w:rPr/>
+        <w:t xml:space="preserve">, </w:t>
+      </w:r>
+      <w:r>
+        <w:rPr>
+          <w:b/>
+        </w:rPr>
+        <w:t xml:space="preserve">users, roles and access</w:t>
+      </w:r>
+      <w:r>
+        <w:rPr/>
+        <w:t xml:space="preserve">, </w:t>
+      </w:r>
+      <w:r>
+        <w:rPr>
+          <w:b/>
+        </w:rPr>
+        <w:t xml:space="preserve">billing</w:t>
+      </w:r>
+      <w:r>
+        <w:rPr/>
+        <w:t xml:space="preserve">, </w:t>
+      </w:r>
+      <w:r>
+        <w:rPr>
+          <w:b/>
+        </w:rPr>
+        <w:t xml:space="preserve">reporting</w:t>
+      </w:r>
+      <w:r>
+        <w:rPr/>
+        <w:t xml:space="preserve"> and </w:t>
+      </w:r>
+      <w:r>
+        <w:rPr>
+          <w:b/>
+        </w:rPr>
+        <w:t xml:space="preserve">mailing campaigns</w:t>
       </w:r>
     </w:p>
     <w:p>
@@ -645,37 +551,47 @@
       </w:pPr>
       <w:r>
         <w:rPr/>
-        <w:t xml:space="preserve">Built the </w:t>
-      </w:r>
-      <w:r>
-        <w:rPr>
-          <w:b/>
-        </w:rPr>
-        <w:t xml:space="preserve">Web Designer from scratch</w:t>
-      </w:r>
-      <w:r>
-        <w:rPr/>
-        <w:t xml:space="preserve"> with an </w:t>
-      </w:r>
-      <w:r>
-        <w:rPr>
-          <w:b/>
-        </w:rPr>
-        <w:t xml:space="preserve">AI agent</w:t>
-      </w:r>
-      <w:r>
-        <w:rPr/>
-        <w:t xml:space="preserve"> for </w:t>
-      </w:r>
-      <w:r>
-        <w:rPr>
-          <w:b/>
-        </w:rPr>
-        <w:t xml:space="preserve">natural-language generation of web applications</w:t>
-      </w:r>
-      <w:r>
-        <w:rPr/>
-        <w:t xml:space="preserve"> — describe a screen, it scaffolds the JSON-defined views, components and bindings</w:t>
+        <w:t xml:space="preserve">Produced the </w:t>
+      </w:r>
+      <w:r>
+        <w:rPr>
+          <w:b/>
+        </w:rPr>
+        <w:t xml:space="preserve">mockups and full design proposal</w:t>
+      </w:r>
+      <w:r>
+        <w:rPr/>
+        <w:t xml:space="preserve">, then a fast </w:t>
+      </w:r>
+      <w:r>
+        <w:rPr>
+          <w:b/>
+        </w:rPr>
+        <w:t xml:space="preserve">Angular 22</w:t>
+      </w:r>
+      <w:r>
+        <w:rPr/>
+        <w:t xml:space="preserve"> SPA on </w:t>
+      </w:r>
+      <w:r>
+        <w:rPr>
+          <w:b/>
+        </w:rPr>
+        <w:t xml:space="preserve">@kouji-ui</w:t>
+      </w:r>
+      <w:r>
+        <w:rPr/>
+        <w:t xml:space="preserve">, my own public library, with a </w:t>
+      </w:r>
+      <w:r>
+        <w:rPr>
+          <w:b/>
+        </w:rPr>
+        <w:t xml:space="preserve">Hono/Node.js</w:t>
+      </w:r>
+      <w:r>
+        <w:rPr/>
+        <w:t xml:space="preserve"> API and PostgreSQL</w:t>
       </w:r>
     </w:p>
     <w:p>
@@ -688,145 +604,47 @@
       </w:pPr>
       <w:r>
         <w:rPr/>
-        <w:t xml:space="preserve">Building the </w:t>
-      </w:r>
-      <w:r>
-        <w:rPr>
-          <w:b/>
-        </w:rPr>
-        <w:t xml:space="preserve">Vibe Toolbox</w:t>
-      </w:r>
-      <w:r>
-        <w:rPr/>
-        <w:t xml:space="preserve">, an internal </w:t>
-      </w:r>
-      <w:r>
-        <w:rPr>
-          <w:b/>
-        </w:rPr>
-        <w:t xml:space="preserve">Electron + Angular</w:t>
-      </w:r>
-      <w:r>
-        <w:rPr/>
-        <w:t xml:space="preserve"> desktop app </w:t>
-      </w:r>
-      <w:r>
-        <w:rPr>
-          <w:b/>
-        </w:rPr>
-        <w:t xml:space="preserve">provisioning AI-ready dev environments</w:t>
-      </w:r>
-      <w:r>
-        <w:rPr/>
-        <w:t xml:space="preserve"> (agent skills, MCP servers), cutting time-to-productivity from days to minutes</w:t>
-      </w:r>
-    </w:p>
-    <w:p>
-      <w:pPr>
-        <w:numPr>
-          <w:ilvl w:val="0"/>
-          <w:numId w:val="2"/>
-        </w:numPr>
-        <w:spacing w:lineRule="auto"/>
-      </w:pPr>
-      <w:r>
-        <w:rPr/>
-        <w:t xml:space="preserve">Built </w:t>
-      </w:r>
-      <w:r>
-        <w:rPr>
-          <w:b/>
-        </w:rPr>
-        <w:t xml:space="preserve">xHarness</w:t>
-      </w:r>
-      <w:r>
-        <w:rPr/>
-        <w:t xml:space="preserve">, a benchmarking platform comparing </w:t>
-      </w:r>
-      <w:r>
-        <w:rPr>
-          <w:b/>
-        </w:rPr>
-        <w:t xml:space="preserve">coding agents</w:t>
-      </w:r>
-      <w:r>
-        <w:rPr/>
-        <w:t xml:space="preserve"> (Claude Code, Codex, OpenCode) across model tiers (Opus, Sonnet, GPT Sol, GPT Terra) on the public </w:t>
-      </w:r>
-      <w:r>
-        <w:rPr>
-          <w:b/>
-        </w:rPr>
-        <w:t xml:space="preserve">SWE-bench</w:t>
-      </w:r>
-      <w:r>
-        <w:rPr/>
-        <w:t xml:space="preserve"> framework, orchestrating parallel runs in </w:t>
-      </w:r>
-      <w:r>
-        <w:rPr>
-          <w:b/>
-        </w:rPr>
-        <w:t xml:space="preserve">Docker</w:t>
-      </w:r>
-      <w:r>
-        <w:rPr/>
-        <w:t xml:space="preserve"> with a </w:t>
-      </w:r>
-      <w:r>
-        <w:rPr>
-          <w:b/>
-        </w:rPr>
-        <w:t xml:space="preserve">cost and usage dashboard</w:t>
-      </w:r>
-    </w:p>
-    <w:p>
-      <w:pPr>
-        <w:numPr>
-          <w:ilvl w:val="0"/>
-          <w:numId w:val="2"/>
-        </w:numPr>
-        <w:spacing w:lineRule="auto"/>
-      </w:pPr>
-      <w:r>
-        <w:rPr/>
-        <w:t xml:space="preserve">Built </w:t>
-      </w:r>
-      <w:r>
-        <w:rPr>
-          <w:b/>
-        </w:rPr>
-        <w:t xml:space="preserve">xShifu</w:t>
-      </w:r>
-      <w:r>
-        <w:rPr/>
-        <w:t xml:space="preserve">, a </w:t>
-      </w:r>
-      <w:r>
-        <w:rPr>
-          <w:b/>
-        </w:rPr>
-        <w:t xml:space="preserve">session analytics tool</w:t>
-      </w:r>
-      <w:r>
-        <w:rPr/>
-        <w:t xml:space="preserve"> that analyses developers' local </w:t>
-      </w:r>
-      <w:r>
-        <w:rPr>
-          <w:b/>
-        </w:rPr>
-        <w:t xml:space="preserve">Claude Code and Codex sessions</w:t>
-      </w:r>
-      <w:r>
-        <w:rPr/>
-        <w:t xml:space="preserve"> to surface how they use coding agents, flag wasteful habits and give </w:t>
-      </w:r>
-      <w:r>
-        <w:rPr>
-          <w:b/>
-        </w:rPr>
-        <w:t xml:space="preserve">actionable recommendations to cut token consumption</w:t>
+        <w:t xml:space="preserve">Secured the platform (</w:t>
+      </w:r>
+      <w:r>
+        <w:rPr>
+          <w:b/>
+        </w:rPr>
+        <w:t xml:space="preserve">passkey/MFA</w:t>
+      </w:r>
+      <w:r>
+        <w:rPr/>
+        <w:t xml:space="preserve">, </w:t>
+      </w:r>
+      <w:r>
+        <w:rPr>
+          <w:b/>
+        </w:rPr>
+        <w:t xml:space="preserve">deny-by-default RBAC</w:t>
+      </w:r>
+      <w:r>
+        <w:rPr/>
+        <w:t xml:space="preserve">) and shipped to </w:t>
+      </w:r>
+      <w:r>
+        <w:rPr>
+          <w:b/>
+        </w:rPr>
+        <w:t xml:space="preserve">staging and production</w:t>
+      </w:r>
+      <w:r>
+        <w:rPr/>
+        <w:t xml:space="preserve"> with </w:t>
+      </w:r>
+      <w:r>
+        <w:rPr>
+          <w:b/>
+        </w:rPr>
+        <w:t xml:space="preserve">Playwright E2E tests</w:t>
+      </w:r>
+      <w:r>
+        <w:rPr/>
+        <w:t xml:space="preserve"> and quality gates</w:t>
       </w:r>
     </w:p>
     <w:p>
@@ -846,7 +664,7 @@
           <w:color w:val="444444"/>
           <w:sz w:val="18"/>
         </w:rPr>
-        <w:t xml:space="preserve"> Angular, TypeScript, Electron, Node.js, Java 8/11/21, Spring Boot, Quarkus, Keycloak, Oracle DB, MongoDB, SQLite, Karma, Jest, Cypress, Playwright, JaCoCo, Webpack, PowerShell, Jenkins, GitLab CI, Claude, Codex, Agile Scrum</w:t>
+        <w:t xml:space="preserve"> Angular 22 (zoneless, signals), kouji-ui, TypeScript, Tailwind CSS 4, Node.js, Hono, BetterAuth (passkeys, TOTP), Zod, Brevo, PostgreSQL 17, Drizzle ORM, Supabase, Vitest, Playwright, Docker, GitHub Actions, Render, OVH, Caddy, pgBackRest</w:t>
       </w:r>
     </w:p>
     <w:p>
@@ -859,7 +677,7 @@
           <w:color w:val="000000"/>
           <w:sz w:val="21"/>
         </w:rPr>
-        <w:t xml:space="preserve">Full Stack Consultant (Java / React) — ZSOFT CONSULTING</w:t>
+        <w:t xml:space="preserve">Senior Full Stack Developer (Angular / Java) — AMUNDI ITS</w:t>
       </w:r>
       <w:r>
         <w:rPr>
@@ -872,19 +690,7 @@
           <w:color w:val="555555"/>
           <w:sz w:val="18"/>
         </w:rPr>
-        <w:t xml:space="preserve">October 2022 – September 2023 (1 year)</w:t>
-      </w:r>
-    </w:p>
-    <w:p>
-      <w:pPr>
-        <w:spacing w:lineRule="auto"/>
-      </w:pPr>
-      <w:r>
-        <w:rPr>
-          <w:b/>
-          <w:sz w:val="20"/>
-        </w:rPr>
-        <w:t xml:space="preserve">Client: Société Générale — Project: KYC</w:t>
+        <w:t xml:space="preserve">September 2023 – October 2026 (3 years 2 months)</w:t>
       </w:r>
     </w:p>
     <w:p>
@@ -897,27 +703,234 @@
       </w:pPr>
       <w:r>
         <w:rPr/>
-        <w:t xml:space="preserve">Led a </w:t>
-      </w:r>
-      <w:r>
-        <w:rPr>
-          <w:b/>
-        </w:rPr>
-        <w:t xml:space="preserve">full-backend mission to extract a standalone, reusable microservice</w:t>
-      </w:r>
-      <w:r>
-        <w:rPr/>
-        <w:t xml:space="preserve"> from a legacy </w:t>
-      </w:r>
-      <w:r>
-        <w:rPr>
-          <w:b/>
-        </w:rPr>
-        <w:t xml:space="preserve">KYC</w:t>
-      </w:r>
-      <w:r>
-        <w:rPr/>
-        <w:t xml:space="preserve"> system, consumable across the organization</w:t>
+        <w:t xml:space="preserve">Maintained and evolved the </w:t>
+      </w:r>
+      <w:r>
+        <w:rPr>
+          <w:b/>
+        </w:rPr>
+        <w:t xml:space="preserve">Maestro Angular framework</w:t>
+      </w:r>
+      <w:r>
+        <w:rPr/>
+        <w:t xml:space="preserve"> used by multiple internal and client-facing applications</w:t>
+      </w:r>
+    </w:p>
+    <w:p>
+      <w:pPr>
+        <w:numPr>
+          <w:ilvl w:val="0"/>
+          <w:numId w:val="3"/>
+        </w:numPr>
+        <w:spacing w:lineRule="auto"/>
+      </w:pPr>
+      <w:r>
+        <w:rPr/>
+        <w:t xml:space="preserve">Actively participated in </w:t>
+      </w:r>
+      <w:r>
+        <w:rPr>
+          <w:b/>
+        </w:rPr>
+        <w:t xml:space="preserve">major Angular version migrations (15 → 18 → 20)</w:t>
+      </w:r>
+      <w:r>
+        <w:rPr/>
+        <w:t xml:space="preserve">, including component upgrades, dependency updates, and adoption of new framework capabilities (Signals, Standalone Components, etc.)</w:t>
+      </w:r>
+    </w:p>
+    <w:p>
+      <w:pPr>
+        <w:numPr>
+          <w:ilvl w:val="0"/>
+          <w:numId w:val="3"/>
+        </w:numPr>
+        <w:spacing w:lineRule="auto"/>
+      </w:pPr>
+      <w:r>
+        <w:rPr/>
+        <w:t xml:space="preserve">Built the </w:t>
+      </w:r>
+      <w:r>
+        <w:rPr>
+          <w:b/>
+        </w:rPr>
+        <w:t xml:space="preserve">Web Designer from scratch</w:t>
+      </w:r>
+      <w:r>
+        <w:rPr/>
+        <w:t xml:space="preserve"> with an </w:t>
+      </w:r>
+      <w:r>
+        <w:rPr>
+          <w:b/>
+        </w:rPr>
+        <w:t xml:space="preserve">AI agent</w:t>
+      </w:r>
+      <w:r>
+        <w:rPr/>
+        <w:t xml:space="preserve"> for </w:t>
+      </w:r>
+      <w:r>
+        <w:rPr>
+          <w:b/>
+        </w:rPr>
+        <w:t xml:space="preserve">natural-language generation of web applications</w:t>
+      </w:r>
+      <w:r>
+        <w:rPr/>
+        <w:t xml:space="preserve"> — describe a screen, it scaffolds the JSON-defined views, components and bindings</w:t>
+      </w:r>
+    </w:p>
+    <w:p>
+      <w:pPr>
+        <w:numPr>
+          <w:ilvl w:val="0"/>
+          <w:numId w:val="3"/>
+        </w:numPr>
+        <w:spacing w:lineRule="auto"/>
+      </w:pPr>
+      <w:r>
+        <w:rPr/>
+        <w:t xml:space="preserve">Building the </w:t>
+      </w:r>
+      <w:r>
+        <w:rPr>
+          <w:b/>
+        </w:rPr>
+        <w:t xml:space="preserve">Vibe Toolbox</w:t>
+      </w:r>
+      <w:r>
+        <w:rPr/>
+        <w:t xml:space="preserve">, an internal </w:t>
+      </w:r>
+      <w:r>
+        <w:rPr>
+          <w:b/>
+        </w:rPr>
+        <w:t xml:space="preserve">Electron + Angular</w:t>
+      </w:r>
+      <w:r>
+        <w:rPr/>
+        <w:t xml:space="preserve"> desktop app </w:t>
+      </w:r>
+      <w:r>
+        <w:rPr>
+          <w:b/>
+        </w:rPr>
+        <w:t xml:space="preserve">provisioning AI-ready dev environments</w:t>
+      </w:r>
+      <w:r>
+        <w:rPr/>
+        <w:t xml:space="preserve"> (agent skills, MCP servers), cutting time-to-productivity from days to minutes</w:t>
+      </w:r>
+    </w:p>
+    <w:p>
+      <w:pPr>
+        <w:numPr>
+          <w:ilvl w:val="0"/>
+          <w:numId w:val="3"/>
+        </w:numPr>
+        <w:spacing w:lineRule="auto"/>
+      </w:pPr>
+      <w:r>
+        <w:rPr/>
+        <w:t xml:space="preserve">Built </w:t>
+      </w:r>
+      <w:r>
+        <w:rPr>
+          <w:b/>
+        </w:rPr>
+        <w:t xml:space="preserve">xHarness</w:t>
+      </w:r>
+      <w:r>
+        <w:rPr/>
+        <w:t xml:space="preserve">, a benchmarking platform comparing </w:t>
+      </w:r>
+      <w:r>
+        <w:rPr>
+          <w:b/>
+        </w:rPr>
+        <w:t xml:space="preserve">coding agents</w:t>
+      </w:r>
+      <w:r>
+        <w:rPr/>
+        <w:t xml:space="preserve"> (Claude Code, Codex, OpenCode) across model tiers (Opus, Sonnet, GPT Sol, GPT Terra) on the public </w:t>
+      </w:r>
+      <w:r>
+        <w:rPr>
+          <w:b/>
+        </w:rPr>
+        <w:t xml:space="preserve">SWE-bench</w:t>
+      </w:r>
+      <w:r>
+        <w:rPr/>
+        <w:t xml:space="preserve"> framework, orchestrating parallel runs in </w:t>
+      </w:r>
+      <w:r>
+        <w:rPr>
+          <w:b/>
+        </w:rPr>
+        <w:t xml:space="preserve">Docker</w:t>
+      </w:r>
+      <w:r>
+        <w:rPr/>
+        <w:t xml:space="preserve"> with a </w:t>
+      </w:r>
+      <w:r>
+        <w:rPr>
+          <w:b/>
+        </w:rPr>
+        <w:t xml:space="preserve">cost and usage dashboard</w:t>
+      </w:r>
+    </w:p>
+    <w:p>
+      <w:pPr>
+        <w:numPr>
+          <w:ilvl w:val="0"/>
+          <w:numId w:val="3"/>
+        </w:numPr>
+        <w:spacing w:lineRule="auto"/>
+      </w:pPr>
+      <w:r>
+        <w:rPr/>
+        <w:t xml:space="preserve">Built </w:t>
+      </w:r>
+      <w:r>
+        <w:rPr>
+          <w:b/>
+        </w:rPr>
+        <w:t xml:space="preserve">xShifu</w:t>
+      </w:r>
+      <w:r>
+        <w:rPr/>
+        <w:t xml:space="preserve">, a </w:t>
+      </w:r>
+      <w:r>
+        <w:rPr>
+          <w:b/>
+        </w:rPr>
+        <w:t xml:space="preserve">session analytics tool</w:t>
+      </w:r>
+      <w:r>
+        <w:rPr/>
+        <w:t xml:space="preserve"> that analyses developers' local </w:t>
+      </w:r>
+      <w:r>
+        <w:rPr>
+          <w:b/>
+        </w:rPr>
+        <w:t xml:space="preserve">Claude Code and Codex sessions</w:t>
+      </w:r>
+      <w:r>
+        <w:rPr/>
+        <w:t xml:space="preserve"> to surface how they use coding agents, flag wasteful habits and give </w:t>
+      </w:r>
+      <w:r>
+        <w:rPr>
+          <w:b/>
+        </w:rPr>
+        <w:t xml:space="preserve">actionable recommendations to cut token consumption</w:t>
       </w:r>
     </w:p>
     <w:p>
@@ -937,19 +950,45 @@
           <w:color w:val="444444"/>
           <w:sz w:val="18"/>
         </w:rPr>
-        <w:t xml:space="preserve"> Java 17, Spring Boot, Spring Security, OAuth2, Quartz, RabbitMQ, PostgreSQL, Flyway, JaCoCo, Docker, Kubernetes, Jenkins</w:t>
-      </w:r>
-    </w:p>
-    <w:p>
-      <w:pPr>
-        <w:spacing w:lineRule="auto"/>
-      </w:pPr>
-      <w:r>
-        <w:rPr>
-          <w:b/>
-          <w:sz w:val="20"/>
-        </w:rPr>
-        <w:t xml:space="preserve">Client: Colas — Project: CRM</w:t>
+        <w:t xml:space="preserve"> Angular, TypeScript, Electron, Node.js, Java 8/11/21, Spring Boot, Quarkus, Keycloak, Oracle DB, MongoDB, SQLite, Karma, Jest, Cypress, Playwright, JaCoCo, Webpack, PowerShell, Jenkins, GitLab CI, Claude, Codex, Agile Scrum</w:t>
+      </w:r>
+    </w:p>
+    <w:p>
+      <w:pPr>
+        <w:spacing w:lineRule="auto"/>
+      </w:pPr>
+      <w:r>
+        <w:rPr>
+          <w:b/>
+          <w:color w:val="000000"/>
+          <w:sz w:val="21"/>
+        </w:rPr>
+        <w:t xml:space="preserve">Full Stack Consultant (Java / React) — ZSOFT CONSULTING</w:t>
+      </w:r>
+      <w:r>
+        <w:rPr>
+          <w:sz w:val="21"/>
+        </w:rPr>
+        <w:br w:type="textWrapping"/>
+      </w:r>
+      <w:r>
+        <w:rPr>
+          <w:color w:val="555555"/>
+          <w:sz w:val="18"/>
+        </w:rPr>
+        <w:t xml:space="preserve">October 2022 – September 2023 (1 year)</w:t>
+      </w:r>
+    </w:p>
+    <w:p>
+      <w:pPr>
+        <w:spacing w:lineRule="auto"/>
+      </w:pPr>
+      <w:r>
+        <w:rPr>
+          <w:b/>
+          <w:sz w:val="20"/>
+        </w:rPr>
+        <w:t xml:space="preserve">Client: Société Générale — Project: KYC</w:t>
       </w:r>
     </w:p>
     <w:p>
@@ -962,23 +1001,27 @@
       </w:pPr>
       <w:r>
         <w:rPr/>
-        <w:t xml:space="preserve">Deployed the application on </w:t>
-      </w:r>
-      <w:r>
-        <w:rPr>
-          <w:b/>
-        </w:rPr>
-        <w:t xml:space="preserve">Azure</w:t>
-      </w:r>
-      <w:r>
-        <w:rPr/>
-        <w:t xml:space="preserve"> (App Services, Front Door, CDN, Blob Storage, PostgreSQL) with </w:t>
-      </w:r>
-      <w:r>
-        <w:rPr>
-          <w:b/>
-        </w:rPr>
-        <w:t xml:space="preserve">CI/CD pipelines</w:t>
+        <w:t xml:space="preserve">Led a </w:t>
+      </w:r>
+      <w:r>
+        <w:rPr>
+          <w:b/>
+        </w:rPr>
+        <w:t xml:space="preserve">full-backend mission to extract a standalone, reusable microservice</w:t>
+      </w:r>
+      <w:r>
+        <w:rPr/>
+        <w:t xml:space="preserve"> from a legacy </w:t>
+      </w:r>
+      <w:r>
+        <w:rPr>
+          <w:b/>
+        </w:rPr>
+        <w:t xml:space="preserve">KYC</w:t>
+      </w:r>
+      <w:r>
+        <w:rPr/>
+        <w:t xml:space="preserve"> system, consumable across the organization</w:t>
       </w:r>
     </w:p>
     <w:p>
@@ -998,19 +1041,19 @@
           <w:color w:val="444444"/>
           <w:sz w:val="18"/>
         </w:rPr>
-        <w:t xml:space="preserve"> React, TypeScript, Ant Design, Java 11, Spring Boot, Spring Security, Spring Batch, Azure (AD, App Services, CDN, Front Door, Blob Storage, PostgreSQL), GitLab CI/CD</w:t>
-      </w:r>
-    </w:p>
-    <w:p>
-      <w:pPr>
-        <w:spacing w:lineRule="auto"/>
-      </w:pPr>
-      <w:r>
-        <w:rPr>
-          <w:b/>
-          <w:sz w:val="20"/>
-        </w:rPr>
-        <w:t xml:space="preserve">Client: gloody.co — Project: HR &amp; Business Management SaaS</w:t>
+        <w:t xml:space="preserve"> Java 17, Spring Boot, Spring Security, OAuth2, Quartz, RabbitMQ, PostgreSQL, Flyway, JaCoCo, Docker, Kubernetes, Jenkins</w:t>
+      </w:r>
+    </w:p>
+    <w:p>
+      <w:pPr>
+        <w:spacing w:lineRule="auto"/>
+      </w:pPr>
+      <w:r>
+        <w:rPr>
+          <w:b/>
+          <w:sz w:val="20"/>
+        </w:rPr>
+        <w:t xml:space="preserve">Client: Colas — Project: CRM</w:t>
       </w:r>
     </w:p>
     <w:p>
@@ -1023,70 +1066,23 @@
       </w:pPr>
       <w:r>
         <w:rPr/>
-        <w:t xml:space="preserve">Delivered </w:t>
-      </w:r>
-      <w:r>
-        <w:rPr>
-          <w:b/>
-        </w:rPr>
-        <w:t xml:space="preserve">full-stack features</w:t>
-      </w:r>
-      <w:r>
-        <w:rPr/>
-        <w:t xml:space="preserve"> across the suite — absences &amp; holidays, invoicing, expense reports and meeting booking — with </w:t>
-      </w:r>
-      <w:r>
-        <w:rPr>
-          <w:b/>
-        </w:rPr>
-        <w:t xml:space="preserve">React / Ant Design</w:t>
-      </w:r>
-      <w:r>
-        <w:rPr/>
-        <w:t xml:space="preserve"> front-ends on </w:t>
-      </w:r>
-      <w:r>
-        <w:rPr>
-          <w:b/>
-        </w:rPr>
-        <w:t xml:space="preserve">Java / Spring Boot</w:t>
-      </w:r>
-      <w:r>
-        <w:rPr/>
-        <w:t xml:space="preserve"> REST APIs</w:t>
-      </w:r>
-    </w:p>
-    <w:p>
-      <w:pPr>
-        <w:numPr>
-          <w:ilvl w:val="0"/>
-          <w:numId w:val="5"/>
-        </w:numPr>
-        <w:spacing w:lineRule="auto"/>
-      </w:pPr>
-      <w:r>
-        <w:rPr/>
-        <w:t xml:space="preserve">Owned the </w:t>
-      </w:r>
-      <w:r>
-        <w:rPr>
-          <w:b/>
-        </w:rPr>
-        <w:t xml:space="preserve">front-end architecture</w:t>
-      </w:r>
-      <w:r>
-        <w:rPr/>
-        <w:t xml:space="preserve">, notably a </w:t>
-      </w:r>
-      <w:r>
-        <w:rPr>
-          <w:b/>
-        </w:rPr>
-        <w:t xml:space="preserve">high-performance calendar</w:t>
-      </w:r>
-      <w:r>
-        <w:rPr/>
-        <w:t xml:space="preserve"> rendering dense scheduling data (absences, holidays, room bookings) with smooth navigation</w:t>
+        <w:t xml:space="preserve">Deployed the application on </w:t>
+      </w:r>
+      <w:r>
+        <w:rPr>
+          <w:b/>
+        </w:rPr>
+        <w:t xml:space="preserve">Azure</w:t>
+      </w:r>
+      <w:r>
+        <w:rPr/>
+        <w:t xml:space="preserve"> (App Services, Front Door, CDN, Blob Storage, PostgreSQL) with </w:t>
+      </w:r>
+      <w:r>
+        <w:rPr>
+          <w:b/>
+        </w:rPr>
+        <w:t xml:space="preserve">CI/CD pipelines</w:t>
       </w:r>
     </w:p>
     <w:p>
@@ -1106,45 +1102,19 @@
           <w:color w:val="444444"/>
           <w:sz w:val="18"/>
         </w:rPr>
-        <w:t xml:space="preserve"> React, TypeScript, Ant Design, SCSS, Java, Spring Boot, REST APIs, AWS</w:t>
-      </w:r>
-    </w:p>
-    <w:p>
-      <w:pPr>
-        <w:spacing w:lineRule="auto"/>
-      </w:pPr>
-      <w:r>
-        <w:rPr>
-          <w:b/>
-          <w:color w:val="000000"/>
-          <w:sz w:val="21"/>
-        </w:rPr>
-        <w:t xml:space="preserve">Full Stack Developer → Project Lead (Java / Angular) — SCOR</w:t>
-      </w:r>
-      <w:r>
-        <w:rPr>
-          <w:sz w:val="21"/>
-        </w:rPr>
-        <w:br w:type="textWrapping"/>
-      </w:r>
-      <w:r>
-        <w:rPr>
-          <w:color w:val="555555"/>
-          <w:sz w:val="18"/>
-        </w:rPr>
-        <w:t xml:space="preserve">June 2019 – September 2022 (3 years 4 months)</w:t>
-      </w:r>
-    </w:p>
-    <w:p>
-      <w:pPr>
-        <w:spacing w:lineRule="auto"/>
-      </w:pPr>
-      <w:r>
-        <w:rPr>
-          <w:b/>
-          <w:sz w:val="20"/>
-        </w:rPr>
-        <w:t xml:space="preserve">Project: RiskReveal</w:t>
+        <w:t xml:space="preserve"> React, TypeScript, Ant Design, Java 11, Spring Boot, Spring Security, Spring Batch, Azure (AD, App Services, CDN, Front Door, Blob Storage, PostgreSQL), GitLab CI/CD</w:t>
+      </w:r>
+    </w:p>
+    <w:p>
+      <w:pPr>
+        <w:spacing w:lineRule="auto"/>
+      </w:pPr>
+      <w:r>
+        <w:rPr>
+          <w:b/>
+          <w:sz w:val="20"/>
+        </w:rPr>
+        <w:t xml:space="preserve">Client: gloody.co — Project: HR &amp; Business Management SaaS</w:t>
       </w:r>
     </w:p>
     <w:p>
@@ -1157,17 +1127,37 @@
       </w:pPr>
       <w:r>
         <w:rPr/>
-        <w:t xml:space="preserve">Grew from full-stack developer into </w:t>
-      </w:r>
-      <w:r>
-        <w:rPr>
-          <w:b/>
-        </w:rPr>
-        <w:t xml:space="preserve">technical / project lead</w:t>
-      </w:r>
-      <w:r>
-        <w:rPr/>
-        <w:t xml:space="preserve">, validating backend (Spring) delivery and driving implementation across the team</w:t>
+        <w:t xml:space="preserve">Delivered </w:t>
+      </w:r>
+      <w:r>
+        <w:rPr>
+          <w:b/>
+        </w:rPr>
+        <w:t xml:space="preserve">full-stack features</w:t>
+      </w:r>
+      <w:r>
+        <w:rPr/>
+        <w:t xml:space="preserve"> across the suite — absences &amp; holidays, invoicing, expense reports and meeting booking — with </w:t>
+      </w:r>
+      <w:r>
+        <w:rPr>
+          <w:b/>
+        </w:rPr>
+        <w:t xml:space="preserve">React / Ant Design</w:t>
+      </w:r>
+      <w:r>
+        <w:rPr/>
+        <w:t xml:space="preserve"> front-ends on </w:t>
+      </w:r>
+      <w:r>
+        <w:rPr>
+          <w:b/>
+        </w:rPr>
+        <w:t xml:space="preserve">Java / Spring Boot</w:t>
+      </w:r>
+      <w:r>
+        <w:rPr/>
+        <w:t xml:space="preserve"> REST APIs</w:t>
       </w:r>
     </w:p>
     <w:p>
@@ -1180,73 +1170,187 @@
       </w:pPr>
       <w:r>
         <w:rPr/>
-        <w:t xml:space="preserve">Built the </w:t>
-      </w:r>
-      <w:r>
-        <w:rPr>
-          <w:b/>
-        </w:rPr>
-        <w:t xml:space="preserve">data-heavy risk UI</w:t>
-      </w:r>
-      <w:r>
-        <w:rPr/>
-        <w:t xml:space="preserve"> on </w:t>
-      </w:r>
-      <w:r>
-        <w:rPr>
-          <w:b/>
-        </w:rPr>
-        <w:t xml:space="preserve">AG Grid</w:t>
-      </w:r>
-      <w:r>
-        <w:rPr/>
-        <w:t xml:space="preserve"> — virtualised grids, grouping and aggregation over large </w:t>
-      </w:r>
-      <w:r>
-        <w:rPr>
-          <w:b/>
-        </w:rPr>
-        <w:t xml:space="preserve">PLT loss datasets</w:t>
+        <w:t xml:space="preserve">Owned the </w:t>
+      </w:r>
+      <w:r>
+        <w:rPr>
+          <w:b/>
+        </w:rPr>
+        <w:t xml:space="preserve">front-end architecture</w:t>
+      </w:r>
+      <w:r>
+        <w:rPr/>
+        <w:t xml:space="preserve">, notably a </w:t>
+      </w:r>
+      <w:r>
+        <w:rPr>
+          <w:b/>
+        </w:rPr>
+        <w:t xml:space="preserve">high-performance calendar</w:t>
+      </w:r>
+      <w:r>
+        <w:rPr/>
+        <w:t xml:space="preserve"> rendering dense scheduling data (absences, holidays, room bookings) with smooth navigation</w:t>
+      </w:r>
+    </w:p>
+    <w:p>
+      <w:pPr>
+        <w:spacing w:lineRule="auto"/>
+      </w:pPr>
+      <w:r>
+        <w:rPr>
+          <w:b/>
+          <w:sz w:val="18"/>
+        </w:rPr>
+        <w:t xml:space="preserve">Technical Environment:</w:t>
+      </w:r>
+      <w:r>
+        <w:rPr>
+          <w:rFonts w:ascii="Consolas" w:hAnsi="Consolas"/>
+          <w:color w:val="444444"/>
+          <w:sz w:val="18"/>
+        </w:rPr>
+        <w:t xml:space="preserve"> React, TypeScript, Ant Design, SCSS, Java, Spring Boot, REST APIs, AWS</w:t>
+      </w:r>
+    </w:p>
+    <w:p>
+      <w:pPr>
+        <w:spacing w:lineRule="auto"/>
+      </w:pPr>
+      <w:r>
+        <w:rPr>
+          <w:b/>
+          <w:color w:val="000000"/>
+          <w:sz w:val="21"/>
+        </w:rPr>
+        <w:t xml:space="preserve">Full Stack Developer → Project Lead (Java / Angular) — SCOR</w:t>
+      </w:r>
+      <w:r>
+        <w:rPr>
+          <w:sz w:val="21"/>
+        </w:rPr>
+        <w:br w:type="textWrapping"/>
+      </w:r>
+      <w:r>
+        <w:rPr>
+          <w:color w:val="555555"/>
+          <w:sz w:val="18"/>
+        </w:rPr>
+        <w:t xml:space="preserve">June 2019 – September 2022 (3 years 4 months)</w:t>
+      </w:r>
+    </w:p>
+    <w:p>
+      <w:pPr>
+        <w:spacing w:lineRule="auto"/>
+      </w:pPr>
+      <w:r>
+        <w:rPr>
+          <w:b/>
+          <w:sz w:val="20"/>
+        </w:rPr>
+        <w:t xml:space="preserve">Project: RiskReveal</w:t>
       </w:r>
     </w:p>
     <w:p>
       <w:pPr>
         <w:numPr>
           <w:ilvl w:val="0"/>
-          <w:numId w:val="6"/>
+          <w:numId w:val="7"/>
         </w:numPr>
         <w:spacing w:lineRule="auto"/>
       </w:pPr>
       <w:r>
         <w:rPr/>
-        <w:t xml:space="preserve">Optimized and evolved the </w:t>
-      </w:r>
-      <w:r>
-        <w:rPr>
-          <w:b/>
-        </w:rPr>
-        <w:t xml:space="preserve">batch orchestration system</w:t>
-      </w:r>
-      <w:r>
-        <w:rPr/>
-        <w:t xml:space="preserve"> (Spring Batch) on large-volume risk data, with </w:t>
-      </w:r>
-      <w:r>
-        <w:rPr>
-          <w:b/>
-        </w:rPr>
-        <w:t xml:space="preserve">WebSockets</w:t>
-      </w:r>
-      <w:r>
-        <w:rPr/>
-        <w:t xml:space="preserve"> for real-time job progress</w:t>
+        <w:t xml:space="preserve">Grew from full-stack developer into </w:t>
+      </w:r>
+      <w:r>
+        <w:rPr>
+          <w:b/>
+        </w:rPr>
+        <w:t xml:space="preserve">technical / project lead</w:t>
+      </w:r>
+      <w:r>
+        <w:rPr/>
+        <w:t xml:space="preserve">, validating backend (Spring) delivery and driving implementation across the team</w:t>
       </w:r>
     </w:p>
     <w:p>
       <w:pPr>
         <w:numPr>
           <w:ilvl w:val="0"/>
-          <w:numId w:val="6"/>
+          <w:numId w:val="7"/>
+        </w:numPr>
+        <w:spacing w:lineRule="auto"/>
+      </w:pPr>
+      <w:r>
+        <w:rPr/>
+        <w:t xml:space="preserve">Built the </w:t>
+      </w:r>
+      <w:r>
+        <w:rPr>
+          <w:b/>
+        </w:rPr>
+        <w:t xml:space="preserve">data-heavy risk UI</w:t>
+      </w:r>
+      <w:r>
+        <w:rPr/>
+        <w:t xml:space="preserve"> on </w:t>
+      </w:r>
+      <w:r>
+        <w:rPr>
+          <w:b/>
+        </w:rPr>
+        <w:t xml:space="preserve">AG Grid</w:t>
+      </w:r>
+      <w:r>
+        <w:rPr/>
+        <w:t xml:space="preserve"> — virtualised grids, grouping and aggregation over large </w:t>
+      </w:r>
+      <w:r>
+        <w:rPr>
+          <w:b/>
+        </w:rPr>
+        <w:t xml:space="preserve">PLT loss datasets</w:t>
+      </w:r>
+    </w:p>
+    <w:p>
+      <w:pPr>
+        <w:numPr>
+          <w:ilvl w:val="0"/>
+          <w:numId w:val="7"/>
+        </w:numPr>
+        <w:spacing w:lineRule="auto"/>
+      </w:pPr>
+      <w:r>
+        <w:rPr/>
+        <w:t xml:space="preserve">Optimized and evolved the </w:t>
+      </w:r>
+      <w:r>
+        <w:rPr>
+          <w:b/>
+        </w:rPr>
+        <w:t xml:space="preserve">batch orchestration system</w:t>
+      </w:r>
+      <w:r>
+        <w:rPr/>
+        <w:t xml:space="preserve"> (Spring Batch) on large-volume risk data, with </w:t>
+      </w:r>
+      <w:r>
+        <w:rPr>
+          <w:b/>
+        </w:rPr>
+        <w:t xml:space="preserve">WebSockets</w:t>
+      </w:r>
+      <w:r>
+        <w:rPr/>
+        <w:t xml:space="preserve"> for real-time job progress</w:t>
+      </w:r>
+    </w:p>
+    <w:p>
+      <w:pPr>
+        <w:numPr>
+          <w:ilvl w:val="0"/>
+          <w:numId w:val="7"/>
         </w:numPr>
         <w:spacing w:lineRule="auto"/>
       </w:pPr>
@@ -2129,6 +2233,128 @@
     </w:lvl>
   </w:abstractNum>
   <w:abstractNum w:abstractNumId="6">
+    <w:lvl w:ilvl="0">
+      <w:start w:val="1"/>
+      <w:numFmt w:val="bullet"/>
+      <w:lvlText w:val=""/>
+      <w:lvlJc w:val="left"/>
+      <w:pPr>
+        <w:tabs>
+          <w:tab w:val="num" w:pos="720"/>
+        </w:tabs>
+        <w:ind w:left="720" w:hanging="360"/>
+      </w:pPr>
+      <w:rPr>
+        <w:rFonts w:ascii="Symbol" w:hAnsi="Symbol" w:hint="default"/>
+      </w:rPr>
+    </w:lvl>
+    <w:lvl w:ilvl="1">
+      <w:start w:val="1"/>
+      <w:numFmt w:val="bullet"/>
+      <w:lvlText w:val=""/>
+      <w:lvlJc w:val="left"/>
+      <w:pPr>
+        <w:tabs>
+          <w:tab w:val="num" w:pos="1440"/>
+        </w:tabs>
+        <w:ind w:left="1440" w:hanging="360"/>
+      </w:pPr>
+      <w:rPr>
+        <w:rFonts w:ascii="Symbol" w:hAnsi="Symbol" w:hint="default"/>
+      </w:rPr>
+    </w:lvl>
+    <w:lvl w:ilvl="2">
+      <w:start w:val="1"/>
+      <w:numFmt w:val="bullet"/>
+      <w:lvlText w:val=""/>
+      <w:lvlJc w:val="left"/>
+      <w:pPr>
+        <w:tabs>
+          <w:tab w:val="num" w:pos="2160"/>
+        </w:tabs>
+        <w:ind w:left="2160" w:hanging="360"/>
+      </w:pPr>
+      <w:rPr>
+        <w:rFonts w:ascii="Symbol" w:hAnsi="Symbol" w:hint="default"/>
+      </w:rPr>
+    </w:lvl>
+    <w:lvl w:ilvl="3">
+      <w:start w:val="1"/>
+      <w:numFmt w:val="bullet"/>
+      <w:lvlText w:val=""/>
+      <w:lvlJc w:val="left"/>
+      <w:pPr>
+        <w:tabs>
+          <w:tab w:val="num" w:pos="2880"/>
+        </w:tabs>
+        <w:ind w:left="2880" w:hanging="360"/>
+      </w:pPr>
+      <w:rPr>
+        <w:rFonts w:ascii="Symbol" w:hAnsi="Symbol" w:hint="default"/>
+      </w:rPr>
+    </w:lvl>
+    <w:lvl w:ilvl="4">
+      <w:start w:val="1"/>
+      <w:numFmt w:val="bullet"/>
+      <w:lvlText w:val=""/>
+      <w:lvlJc w:val="left"/>
+      <w:pPr>
+        <w:tabs>
+          <w:tab w:val="num" w:pos="3600"/>
+        </w:tabs>
+        <w:ind w:left="3600" w:hanging="360"/>
+      </w:pPr>
+      <w:rPr>
+        <w:rFonts w:ascii="Symbol" w:hAnsi="Symbol" w:hint="default"/>
+      </w:rPr>
+    </w:lvl>
+    <w:lvl w:ilvl="5">
+      <w:start w:val="1"/>
+      <w:numFmt w:val="bullet"/>
+      <w:lvlText w:val=""/>
+      <w:lvlJc w:val="left"/>
+      <w:pPr>
+        <w:tabs>
+          <w:tab w:val="num" w:pos="4320"/>
+        </w:tabs>
+        <w:ind w:left="4320" w:hanging="360"/>
+      </w:pPr>
+      <w:rPr>
+        <w:rFonts w:ascii="Symbol" w:hAnsi="Symbol" w:hint="default"/>
+      </w:rPr>
+    </w:lvl>
+    <w:lvl w:ilvl="6">
+      <w:start w:val="1"/>
+      <w:numFmt w:val="bullet"/>
+      <w:lvlText w:val=""/>
+      <w:lvlJc w:val="left"/>
+      <w:pPr>
+        <w:tabs>
+          <w:tab w:val="num" w:pos="5040"/>
+        </w:tabs>
+        <w:ind w:left="5040" w:hanging="360"/>
+      </w:pPr>
+      <w:rPr>
+        <w:rFonts w:ascii="Symbol" w:hAnsi="Symbol" w:hint="default"/>
+      </w:rPr>
+    </w:lvl>
+    <w:lvl w:ilvl="7">
+      <w:start w:val="1"/>
+      <w:numFmt w:val="bullet"/>
+      <w:lvlText w:val=""/>
+      <w:lvlJc w:val="left"/>
+      <w:pPr>
+        <w:tabs>
+          <w:tab w:val="num" w:pos="5760"/>
+        </w:tabs>
+        <w:ind w:left="5760" w:hanging="360"/>
+      </w:pPr>
+      <w:rPr>
+        <w:rFonts w:ascii="Symbol" w:hAnsi="Symbol" w:hint="default"/>
+      </w:rPr>
+    </w:lvl>
+  </w:abstractNum>
+  <w:abstractNum w:abstractNumId="7">
     <w:lvl w:ilvl="0">
       <w:start w:val="1"/>
       <w:numFmt w:val="bullet"/>
@@ -2267,6 +2493,9 @@
   </w:num>
   <w:num w:numId="6">
     <w:abstractNumId w:val="6"/>
+  </w:num>
+  <w:num w:numId="7">
+    <w:abstractNumId w:val="7"/>
   </w:num>
 </w:numbering>
 </file>

</xml_diff>

<commit_message>
Keep the TotalEnergies tasks to the long CV until the mission starts
Claude-Session: https://claude.ai/code/session_01G9HeVjSCmghPePaaX2f7Be
</commit_message>
<xml_diff>
--- a/assets/najih-driss-cv-en-short.docx
+++ b/assets/najih-driss-cv-en-short.docx
@@ -331,6 +331,52 @@
     </w:p>
     <w:p>
       <w:pPr>
+        <w:spacing w:lineRule="auto"/>
+      </w:pPr>
+      <w:r>
+        <w:rPr>
+          <w:b/>
+          <w:sz w:val="18"/>
+        </w:rPr>
+        <w:t xml:space="preserve">Technical Environment:</w:t>
+      </w:r>
+      <w:r>
+        <w:rPr>
+          <w:rFonts w:ascii="Consolas" w:hAnsi="Consolas"/>
+          <w:color w:val="444444"/>
+          <w:sz w:val="18"/>
+        </w:rPr>
+        <w:t xml:space="preserve"> TypeScript, Python, Angular, Node.js, Git, GitHub, GitHub Actions</w:t>
+      </w:r>
+    </w:p>
+    <w:p>
+      <w:pPr>
+        <w:spacing w:lineRule="auto"/>
+      </w:pPr>
+      <w:r>
+        <w:rPr>
+          <w:b/>
+          <w:color w:val="000000"/>
+          <w:sz w:val="21"/>
+        </w:rPr>
+        <w:t xml:space="preserve">Full Stack Developer (Angular / Node.js) — PREESM GROUP</w:t>
+      </w:r>
+      <w:r>
+        <w:rPr>
+          <w:sz w:val="21"/>
+        </w:rPr>
+        <w:br w:type="textWrapping"/>
+      </w:r>
+      <w:r>
+        <w:rPr>
+          <w:color w:val="555555"/>
+          <w:sz w:val="18"/>
+        </w:rPr>
+        <w:t xml:space="preserve">May 2026 – October 2026 (6 months)</w:t>
+      </w:r>
+    </w:p>
+    <w:p>
+      <w:pPr>
         <w:numPr>
           <w:ilvl w:val="0"/>
           <w:numId w:val="1"/>
@@ -339,23 +385,23 @@
       </w:pPr>
       <w:r>
         <w:rPr/>
-        <w:t xml:space="preserve">Full stack development of </w:t>
-      </w:r>
-      <w:r>
-        <w:rPr>
-          <w:b/>
-        </w:rPr>
-        <w:t xml:space="preserve">AI-powered applications</w:t>
-      </w:r>
-      <w:r>
-        <w:rPr/>
-        <w:t xml:space="preserve">, across </w:t>
-      </w:r>
-      <w:r>
-        <w:rPr>
-          <w:b/>
-        </w:rPr>
-        <w:t xml:space="preserve">back end and front end</w:t>
+        <w:t xml:space="preserve">Created </w:t>
+      </w:r>
+      <w:r>
+        <w:rPr>
+          <w:b/>
+        </w:rPr>
+        <w:t xml:space="preserve">Preesm Portal</w:t>
+      </w:r>
+      <w:r>
+        <w:rPr/>
+        <w:t xml:space="preserve"> end to end — product design, </w:t>
+      </w:r>
+      <w:r>
+        <w:rPr>
+          <w:b/>
+        </w:rPr>
+        <w:t xml:space="preserve">architecture, tech choices and infrastructure</w:t>
       </w:r>
     </w:p>
     <w:p>
@@ -368,13 +414,63 @@
       </w:pPr>
       <w:r>
         <w:rPr/>
-        <w:t xml:space="preserve">Services and interfaces built mainly in </w:t>
-      </w:r>
-      <w:r>
-        <w:rPr>
-          <w:b/>
-        </w:rPr>
-        <w:t xml:space="preserve">TypeScript</w:t>
+        <w:t xml:space="preserve">Delivered the core modules: </w:t>
+      </w:r>
+      <w:r>
+        <w:rPr>
+          <w:b/>
+        </w:rPr>
+        <w:t xml:space="preserve">franchisee onboarding</w:t>
+      </w:r>
+      <w:r>
+        <w:rPr/>
+        <w:t xml:space="preserve">, </w:t>
+      </w:r>
+      <w:r>
+        <w:rPr>
+          <w:b/>
+        </w:rPr>
+        <w:t xml:space="preserve">document generation with e-signature</w:t>
+      </w:r>
+      <w:r>
+        <w:rPr/>
+        <w:t xml:space="preserve">, </w:t>
+      </w:r>
+      <w:r>
+        <w:rPr>
+          <w:b/>
+        </w:rPr>
+        <w:t xml:space="preserve">file deposit</w:t>
+      </w:r>
+      <w:r>
+        <w:rPr/>
+        <w:t xml:space="preserve">, </w:t>
+      </w:r>
+      <w:r>
+        <w:rPr>
+          <w:b/>
+        </w:rPr>
+        <w:t xml:space="preserve">users, roles and access</w:t>
+      </w:r>
+      <w:r>
+        <w:rPr/>
+        <w:t xml:space="preserve">, </w:t>
+      </w:r>
+      <w:r>
+        <w:rPr>
+          <w:b/>
+        </w:rPr>
+        <w:t xml:space="preserve">billing</w:t>
+      </w:r>
+      <w:r>
+        <w:rPr/>
+        <w:t xml:space="preserve">, </w:t>
+      </w:r>
+      <w:r>
+        <w:rPr>
+          <w:b/>
+        </w:rPr>
+        <w:t xml:space="preserve">reporting</w:t>
       </w:r>
       <w:r>
         <w:rPr/>
@@ -384,7 +480,113 @@
         <w:rPr>
           <w:b/>
         </w:rPr>
-        <w:t xml:space="preserve">Python</w:t>
+        <w:t xml:space="preserve">mailing campaigns</w:t>
+      </w:r>
+    </w:p>
+    <w:p>
+      <w:pPr>
+        <w:numPr>
+          <w:ilvl w:val="0"/>
+          <w:numId w:val="1"/>
+        </w:numPr>
+        <w:spacing w:lineRule="auto"/>
+      </w:pPr>
+      <w:r>
+        <w:rPr/>
+        <w:t xml:space="preserve">Produced the </w:t>
+      </w:r>
+      <w:r>
+        <w:rPr>
+          <w:b/>
+        </w:rPr>
+        <w:t xml:space="preserve">mockups and full design proposal</w:t>
+      </w:r>
+      <w:r>
+        <w:rPr/>
+        <w:t xml:space="preserve">, then a fast </w:t>
+      </w:r>
+      <w:r>
+        <w:rPr>
+          <w:b/>
+        </w:rPr>
+        <w:t xml:space="preserve">Angular 22</w:t>
+      </w:r>
+      <w:r>
+        <w:rPr/>
+        <w:t xml:space="preserve"> SPA on </w:t>
+      </w:r>
+      <w:r>
+        <w:rPr>
+          <w:b/>
+        </w:rPr>
+        <w:t xml:space="preserve">@kouji-ui</w:t>
+      </w:r>
+      <w:r>
+        <w:rPr/>
+        <w:t xml:space="preserve">, my own public library, with a </w:t>
+      </w:r>
+      <w:r>
+        <w:rPr>
+          <w:b/>
+        </w:rPr>
+        <w:t xml:space="preserve">Hono/Node.js</w:t>
+      </w:r>
+      <w:r>
+        <w:rPr/>
+        <w:t xml:space="preserve"> API and PostgreSQL</w:t>
+      </w:r>
+    </w:p>
+    <w:p>
+      <w:pPr>
+        <w:numPr>
+          <w:ilvl w:val="0"/>
+          <w:numId w:val="1"/>
+        </w:numPr>
+        <w:spacing w:lineRule="auto"/>
+      </w:pPr>
+      <w:r>
+        <w:rPr/>
+        <w:t xml:space="preserve">Secured the platform (</w:t>
+      </w:r>
+      <w:r>
+        <w:rPr>
+          <w:b/>
+        </w:rPr>
+        <w:t xml:space="preserve">passkey/MFA</w:t>
+      </w:r>
+      <w:r>
+        <w:rPr/>
+        <w:t xml:space="preserve">, </w:t>
+      </w:r>
+      <w:r>
+        <w:rPr>
+          <w:b/>
+        </w:rPr>
+        <w:t xml:space="preserve">deny-by-default RBAC</w:t>
+      </w:r>
+      <w:r>
+        <w:rPr/>
+        <w:t xml:space="preserve">) and shipped to </w:t>
+      </w:r>
+      <w:r>
+        <w:rPr>
+          <w:b/>
+        </w:rPr>
+        <w:t xml:space="preserve">staging and production</w:t>
+      </w:r>
+      <w:r>
+        <w:rPr/>
+        <w:t xml:space="preserve"> with </w:t>
+      </w:r>
+      <w:r>
+        <w:rPr>
+          <w:b/>
+        </w:rPr>
+        <w:t xml:space="preserve">Playwright E2E tests</w:t>
+      </w:r>
+      <w:r>
+        <w:rPr/>
+        <w:t xml:space="preserve"> and quality gates</w:t>
       </w:r>
     </w:p>
     <w:p>
@@ -404,7 +606,7 @@
           <w:color w:val="444444"/>
           <w:sz w:val="18"/>
         </w:rPr>
-        <w:t xml:space="preserve"> TypeScript, Python, Angular, Node.js, Git, GitHub, GitHub Actions</w:t>
+        <w:t xml:space="preserve"> Angular 22 (zoneless, signals), kouji-ui, TypeScript, Tailwind CSS 4, Node.js, Hono, BetterAuth (passkeys, TOTP), Zod, Brevo, PostgreSQL 17, Drizzle ORM, Supabase, Vitest, Playwright, Docker, GitHub Actions, Render, OVH, Caddy, pgBackRest</w:t>
       </w:r>
     </w:p>
     <w:p>
@@ -417,7 +619,7 @@
           <w:color w:val="000000"/>
           <w:sz w:val="21"/>
         </w:rPr>
-        <w:t xml:space="preserve">Full Stack Developer (Angular / Node.js) — PREESM GROUP</w:t>
+        <w:t xml:space="preserve">Senior Full Stack Developer (Angular / Java) — AMUNDI ITS</w:t>
       </w:r>
       <w:r>
         <w:rPr>
@@ -430,7 +632,7 @@
           <w:color w:val="555555"/>
           <w:sz w:val="18"/>
         </w:rPr>
-        <w:t xml:space="preserve">May 2026 – October 2026 (6 months)</w:t>
+        <w:t xml:space="preserve">September 2023 – October 2026 (3 years 2 months)</w:t>
       </w:r>
     </w:p>
     <w:p>
@@ -443,23 +645,17 @@
       </w:pPr>
       <w:r>
         <w:rPr/>
-        <w:t xml:space="preserve">Created </w:t>
-      </w:r>
-      <w:r>
-        <w:rPr>
-          <w:b/>
-        </w:rPr>
-        <w:t xml:space="preserve">Preesm Portal</w:t>
-      </w:r>
-      <w:r>
-        <w:rPr/>
-        <w:t xml:space="preserve"> end to end — product design, </w:t>
-      </w:r>
-      <w:r>
-        <w:rPr>
-          <w:b/>
-        </w:rPr>
-        <w:t xml:space="preserve">architecture, tech choices and infrastructure</w:t>
+        <w:t xml:space="preserve">Maintained and evolved the </w:t>
+      </w:r>
+      <w:r>
+        <w:rPr>
+          <w:b/>
+        </w:rPr>
+        <w:t xml:space="preserve">Maestro Angular framework</w:t>
+      </w:r>
+      <w:r>
+        <w:rPr/>
+        <w:t xml:space="preserve"> used by multiple internal and client-facing applications</w:t>
       </w:r>
     </w:p>
     <w:p>
@@ -472,73 +668,17 @@
       </w:pPr>
       <w:r>
         <w:rPr/>
-        <w:t xml:space="preserve">Delivered the core modules: </w:t>
-      </w:r>
-      <w:r>
-        <w:rPr>
-          <w:b/>
-        </w:rPr>
-        <w:t xml:space="preserve">franchisee onboarding</w:t>
-      </w:r>
-      <w:r>
-        <w:rPr/>
-        <w:t xml:space="preserve">, </w:t>
-      </w:r>
-      <w:r>
-        <w:rPr>
-          <w:b/>
-        </w:rPr>
-        <w:t xml:space="preserve">document generation with e-signature</w:t>
-      </w:r>
-      <w:r>
-        <w:rPr/>
-        <w:t xml:space="preserve">, </w:t>
-      </w:r>
-      <w:r>
-        <w:rPr>
-          <w:b/>
-        </w:rPr>
-        <w:t xml:space="preserve">file deposit</w:t>
-      </w:r>
-      <w:r>
-        <w:rPr/>
-        <w:t xml:space="preserve">, </w:t>
-      </w:r>
-      <w:r>
-        <w:rPr>
-          <w:b/>
-        </w:rPr>
-        <w:t xml:space="preserve">users, roles and access</w:t>
-      </w:r>
-      <w:r>
-        <w:rPr/>
-        <w:t xml:space="preserve">, </w:t>
-      </w:r>
-      <w:r>
-        <w:rPr>
-          <w:b/>
-        </w:rPr>
-        <w:t xml:space="preserve">billing</w:t>
-      </w:r>
-      <w:r>
-        <w:rPr/>
-        <w:t xml:space="preserve">, </w:t>
-      </w:r>
-      <w:r>
-        <w:rPr>
-          <w:b/>
-        </w:rPr>
-        <w:t xml:space="preserve">reporting</w:t>
-      </w:r>
-      <w:r>
-        <w:rPr/>
-        <w:t xml:space="preserve"> and </w:t>
-      </w:r>
-      <w:r>
-        <w:rPr>
-          <w:b/>
-        </w:rPr>
-        <w:t xml:space="preserve">mailing campaigns</w:t>
+        <w:t xml:space="preserve">Actively participated in </w:t>
+      </w:r>
+      <w:r>
+        <w:rPr>
+          <w:b/>
+        </w:rPr>
+        <w:t xml:space="preserve">major Angular version migrations (15 → 18 → 20)</w:t>
+      </w:r>
+      <w:r>
+        <w:rPr/>
+        <w:t xml:space="preserve">, including component upgrades, dependency updates, and adoption of new framework capabilities (Signals, Standalone Components, etc.)</w:t>
       </w:r>
     </w:p>
     <w:p>
@@ -551,47 +691,37 @@
       </w:pPr>
       <w:r>
         <w:rPr/>
-        <w:t xml:space="preserve">Produced the </w:t>
-      </w:r>
-      <w:r>
-        <w:rPr>
-          <w:b/>
-        </w:rPr>
-        <w:t xml:space="preserve">mockups and full design proposal</w:t>
-      </w:r>
-      <w:r>
-        <w:rPr/>
-        <w:t xml:space="preserve">, then a fast </w:t>
-      </w:r>
-      <w:r>
-        <w:rPr>
-          <w:b/>
-        </w:rPr>
-        <w:t xml:space="preserve">Angular 22</w:t>
-      </w:r>
-      <w:r>
-        <w:rPr/>
-        <w:t xml:space="preserve"> SPA on </w:t>
-      </w:r>
-      <w:r>
-        <w:rPr>
-          <w:b/>
-        </w:rPr>
-        <w:t xml:space="preserve">@kouji-ui</w:t>
-      </w:r>
-      <w:r>
-        <w:rPr/>
-        <w:t xml:space="preserve">, my own public library, with a </w:t>
-      </w:r>
-      <w:r>
-        <w:rPr>
-          <w:b/>
-        </w:rPr>
-        <w:t xml:space="preserve">Hono/Node.js</w:t>
-      </w:r>
-      <w:r>
-        <w:rPr/>
-        <w:t xml:space="preserve"> API and PostgreSQL</w:t>
+        <w:t xml:space="preserve">Built the </w:t>
+      </w:r>
+      <w:r>
+        <w:rPr>
+          <w:b/>
+        </w:rPr>
+        <w:t xml:space="preserve">Web Designer from scratch</w:t>
+      </w:r>
+      <w:r>
+        <w:rPr/>
+        <w:t xml:space="preserve"> with an </w:t>
+      </w:r>
+      <w:r>
+        <w:rPr>
+          <w:b/>
+        </w:rPr>
+        <w:t xml:space="preserve">AI agent</w:t>
+      </w:r>
+      <w:r>
+        <w:rPr/>
+        <w:t xml:space="preserve"> for </w:t>
+      </w:r>
+      <w:r>
+        <w:rPr>
+          <w:b/>
+        </w:rPr>
+        <w:t xml:space="preserve">natural-language generation of web applications</w:t>
+      </w:r>
+      <w:r>
+        <w:rPr/>
+        <w:t xml:space="preserve"> — describe a screen, it scaffolds the JSON-defined views, components and bindings</w:t>
       </w:r>
     </w:p>
     <w:p>
@@ -604,47 +734,145 @@
       </w:pPr>
       <w:r>
         <w:rPr/>
-        <w:t xml:space="preserve">Secured the platform (</w:t>
-      </w:r>
-      <w:r>
-        <w:rPr>
-          <w:b/>
-        </w:rPr>
-        <w:t xml:space="preserve">passkey/MFA</w:t>
-      </w:r>
-      <w:r>
-        <w:rPr/>
-        <w:t xml:space="preserve">, </w:t>
-      </w:r>
-      <w:r>
-        <w:rPr>
-          <w:b/>
-        </w:rPr>
-        <w:t xml:space="preserve">deny-by-default RBAC</w:t>
-      </w:r>
-      <w:r>
-        <w:rPr/>
-        <w:t xml:space="preserve">) and shipped to </w:t>
-      </w:r>
-      <w:r>
-        <w:rPr>
-          <w:b/>
-        </w:rPr>
-        <w:t xml:space="preserve">staging and production</w:t>
-      </w:r>
-      <w:r>
-        <w:rPr/>
-        <w:t xml:space="preserve"> with </w:t>
-      </w:r>
-      <w:r>
-        <w:rPr>
-          <w:b/>
-        </w:rPr>
-        <w:t xml:space="preserve">Playwright E2E tests</w:t>
-      </w:r>
-      <w:r>
-        <w:rPr/>
-        <w:t xml:space="preserve"> and quality gates</w:t>
+        <w:t xml:space="preserve">Building the </w:t>
+      </w:r>
+      <w:r>
+        <w:rPr>
+          <w:b/>
+        </w:rPr>
+        <w:t xml:space="preserve">Vibe Toolbox</w:t>
+      </w:r>
+      <w:r>
+        <w:rPr/>
+        <w:t xml:space="preserve">, an internal </w:t>
+      </w:r>
+      <w:r>
+        <w:rPr>
+          <w:b/>
+        </w:rPr>
+        <w:t xml:space="preserve">Electron + Angular</w:t>
+      </w:r>
+      <w:r>
+        <w:rPr/>
+        <w:t xml:space="preserve"> desktop app </w:t>
+      </w:r>
+      <w:r>
+        <w:rPr>
+          <w:b/>
+        </w:rPr>
+        <w:t xml:space="preserve">provisioning AI-ready dev environments</w:t>
+      </w:r>
+      <w:r>
+        <w:rPr/>
+        <w:t xml:space="preserve"> (agent skills, MCP servers), cutting time-to-productivity from days to minutes</w:t>
+      </w:r>
+    </w:p>
+    <w:p>
+      <w:pPr>
+        <w:numPr>
+          <w:ilvl w:val="0"/>
+          <w:numId w:val="2"/>
+        </w:numPr>
+        <w:spacing w:lineRule="auto"/>
+      </w:pPr>
+      <w:r>
+        <w:rPr/>
+        <w:t xml:space="preserve">Built </w:t>
+      </w:r>
+      <w:r>
+        <w:rPr>
+          <w:b/>
+        </w:rPr>
+        <w:t xml:space="preserve">xHarness</w:t>
+      </w:r>
+      <w:r>
+        <w:rPr/>
+        <w:t xml:space="preserve">, a benchmarking platform comparing </w:t>
+      </w:r>
+      <w:r>
+        <w:rPr>
+          <w:b/>
+        </w:rPr>
+        <w:t xml:space="preserve">coding agents</w:t>
+      </w:r>
+      <w:r>
+        <w:rPr/>
+        <w:t xml:space="preserve"> (Claude Code, Codex, OpenCode) across model tiers (Opus, Sonnet, GPT Sol, GPT Terra) on the public </w:t>
+      </w:r>
+      <w:r>
+        <w:rPr>
+          <w:b/>
+        </w:rPr>
+        <w:t xml:space="preserve">SWE-bench</w:t>
+      </w:r>
+      <w:r>
+        <w:rPr/>
+        <w:t xml:space="preserve"> framework, orchestrating parallel runs in </w:t>
+      </w:r>
+      <w:r>
+        <w:rPr>
+          <w:b/>
+        </w:rPr>
+        <w:t xml:space="preserve">Docker</w:t>
+      </w:r>
+      <w:r>
+        <w:rPr/>
+        <w:t xml:space="preserve"> with a </w:t>
+      </w:r>
+      <w:r>
+        <w:rPr>
+          <w:b/>
+        </w:rPr>
+        <w:t xml:space="preserve">cost and usage dashboard</w:t>
+      </w:r>
+    </w:p>
+    <w:p>
+      <w:pPr>
+        <w:numPr>
+          <w:ilvl w:val="0"/>
+          <w:numId w:val="2"/>
+        </w:numPr>
+        <w:spacing w:lineRule="auto"/>
+      </w:pPr>
+      <w:r>
+        <w:rPr/>
+        <w:t xml:space="preserve">Built </w:t>
+      </w:r>
+      <w:r>
+        <w:rPr>
+          <w:b/>
+        </w:rPr>
+        <w:t xml:space="preserve">xShifu</w:t>
+      </w:r>
+      <w:r>
+        <w:rPr/>
+        <w:t xml:space="preserve">, a </w:t>
+      </w:r>
+      <w:r>
+        <w:rPr>
+          <w:b/>
+        </w:rPr>
+        <w:t xml:space="preserve">session analytics tool</w:t>
+      </w:r>
+      <w:r>
+        <w:rPr/>
+        <w:t xml:space="preserve"> that analyses developers' local </w:t>
+      </w:r>
+      <w:r>
+        <w:rPr>
+          <w:b/>
+        </w:rPr>
+        <w:t xml:space="preserve">Claude Code and Codex sessions</w:t>
+      </w:r>
+      <w:r>
+        <w:rPr/>
+        <w:t xml:space="preserve"> to surface how they use coding agents, flag wasteful habits and give </w:t>
+      </w:r>
+      <w:r>
+        <w:rPr>
+          <w:b/>
+        </w:rPr>
+        <w:t xml:space="preserve">actionable recommendations to cut token consumption</w:t>
       </w:r>
     </w:p>
     <w:p>
@@ -664,7 +892,7 @@
           <w:color w:val="444444"/>
           <w:sz w:val="18"/>
         </w:rPr>
-        <w:t xml:space="preserve"> Angular 22 (zoneless, signals), kouji-ui, TypeScript, Tailwind CSS 4, Node.js, Hono, BetterAuth (passkeys, TOTP), Zod, Brevo, PostgreSQL 17, Drizzle ORM, Supabase, Vitest, Playwright, Docker, GitHub Actions, Render, OVH, Caddy, pgBackRest</w:t>
+        <w:t xml:space="preserve"> Angular, TypeScript, Electron, Node.js, Java 8/11/21, Spring Boot, Quarkus, Keycloak, Oracle DB, MongoDB, SQLite, Karma, Jest, Cypress, Playwright, JaCoCo, Webpack, PowerShell, Jenkins, GitLab CI, Claude, Codex, Agile Scrum</w:t>
       </w:r>
     </w:p>
     <w:p>
@@ -677,7 +905,7 @@
           <w:color w:val="000000"/>
           <w:sz w:val="21"/>
         </w:rPr>
-        <w:t xml:space="preserve">Senior Full Stack Developer (Angular / Java) — AMUNDI ITS</w:t>
+        <w:t xml:space="preserve">Full Stack Consultant (Java / React) — ZSOFT CONSULTING</w:t>
       </w:r>
       <w:r>
         <w:rPr>
@@ -690,7 +918,19 @@
           <w:color w:val="555555"/>
           <w:sz w:val="18"/>
         </w:rPr>
-        <w:t xml:space="preserve">September 2023 – October 2026 (3 years 2 months)</w:t>
+        <w:t xml:space="preserve">October 2022 – September 2023 (1 year)</w:t>
+      </w:r>
+    </w:p>
+    <w:p>
+      <w:pPr>
+        <w:spacing w:lineRule="auto"/>
+      </w:pPr>
+      <w:r>
+        <w:rPr>
+          <w:b/>
+          <w:sz w:val="20"/>
+        </w:rPr>
+        <w:t xml:space="preserve">Client: Société Générale — Project: KYC</w:t>
       </w:r>
     </w:p>
     <w:p>
@@ -703,234 +943,27 @@
       </w:pPr>
       <w:r>
         <w:rPr/>
-        <w:t xml:space="preserve">Maintained and evolved the </w:t>
-      </w:r>
-      <w:r>
-        <w:rPr>
-          <w:b/>
-        </w:rPr>
-        <w:t xml:space="preserve">Maestro Angular framework</w:t>
-      </w:r>
-      <w:r>
-        <w:rPr/>
-        <w:t xml:space="preserve"> used by multiple internal and client-facing applications</w:t>
-      </w:r>
-    </w:p>
-    <w:p>
-      <w:pPr>
-        <w:numPr>
-          <w:ilvl w:val="0"/>
-          <w:numId w:val="3"/>
-        </w:numPr>
-        <w:spacing w:lineRule="auto"/>
-      </w:pPr>
-      <w:r>
-        <w:rPr/>
-        <w:t xml:space="preserve">Actively participated in </w:t>
-      </w:r>
-      <w:r>
-        <w:rPr>
-          <w:b/>
-        </w:rPr>
-        <w:t xml:space="preserve">major Angular version migrations (15 → 18 → 20)</w:t>
-      </w:r>
-      <w:r>
-        <w:rPr/>
-        <w:t xml:space="preserve">, including component upgrades, dependency updates, and adoption of new framework capabilities (Signals, Standalone Components, etc.)</w:t>
-      </w:r>
-    </w:p>
-    <w:p>
-      <w:pPr>
-        <w:numPr>
-          <w:ilvl w:val="0"/>
-          <w:numId w:val="3"/>
-        </w:numPr>
-        <w:spacing w:lineRule="auto"/>
-      </w:pPr>
-      <w:r>
-        <w:rPr/>
-        <w:t xml:space="preserve">Built the </w:t>
-      </w:r>
-      <w:r>
-        <w:rPr>
-          <w:b/>
-        </w:rPr>
-        <w:t xml:space="preserve">Web Designer from scratch</w:t>
-      </w:r>
-      <w:r>
-        <w:rPr/>
-        <w:t xml:space="preserve"> with an </w:t>
-      </w:r>
-      <w:r>
-        <w:rPr>
-          <w:b/>
-        </w:rPr>
-        <w:t xml:space="preserve">AI agent</w:t>
-      </w:r>
-      <w:r>
-        <w:rPr/>
-        <w:t xml:space="preserve"> for </w:t>
-      </w:r>
-      <w:r>
-        <w:rPr>
-          <w:b/>
-        </w:rPr>
-        <w:t xml:space="preserve">natural-language generation of web applications</w:t>
-      </w:r>
-      <w:r>
-        <w:rPr/>
-        <w:t xml:space="preserve"> — describe a screen, it scaffolds the JSON-defined views, components and bindings</w:t>
-      </w:r>
-    </w:p>
-    <w:p>
-      <w:pPr>
-        <w:numPr>
-          <w:ilvl w:val="0"/>
-          <w:numId w:val="3"/>
-        </w:numPr>
-        <w:spacing w:lineRule="auto"/>
-      </w:pPr>
-      <w:r>
-        <w:rPr/>
-        <w:t xml:space="preserve">Building the </w:t>
-      </w:r>
-      <w:r>
-        <w:rPr>
-          <w:b/>
-        </w:rPr>
-        <w:t xml:space="preserve">Vibe Toolbox</w:t>
-      </w:r>
-      <w:r>
-        <w:rPr/>
-        <w:t xml:space="preserve">, an internal </w:t>
-      </w:r>
-      <w:r>
-        <w:rPr>
-          <w:b/>
-        </w:rPr>
-        <w:t xml:space="preserve">Electron + Angular</w:t>
-      </w:r>
-      <w:r>
-        <w:rPr/>
-        <w:t xml:space="preserve"> desktop app </w:t>
-      </w:r>
-      <w:r>
-        <w:rPr>
-          <w:b/>
-        </w:rPr>
-        <w:t xml:space="preserve">provisioning AI-ready dev environments</w:t>
-      </w:r>
-      <w:r>
-        <w:rPr/>
-        <w:t xml:space="preserve"> (agent skills, MCP servers), cutting time-to-productivity from days to minutes</w:t>
-      </w:r>
-    </w:p>
-    <w:p>
-      <w:pPr>
-        <w:numPr>
-          <w:ilvl w:val="0"/>
-          <w:numId w:val="3"/>
-        </w:numPr>
-        <w:spacing w:lineRule="auto"/>
-      </w:pPr>
-      <w:r>
-        <w:rPr/>
-        <w:t xml:space="preserve">Built </w:t>
-      </w:r>
-      <w:r>
-        <w:rPr>
-          <w:b/>
-        </w:rPr>
-        <w:t xml:space="preserve">xHarness</w:t>
-      </w:r>
-      <w:r>
-        <w:rPr/>
-        <w:t xml:space="preserve">, a benchmarking platform comparing </w:t>
-      </w:r>
-      <w:r>
-        <w:rPr>
-          <w:b/>
-        </w:rPr>
-        <w:t xml:space="preserve">coding agents</w:t>
-      </w:r>
-      <w:r>
-        <w:rPr/>
-        <w:t xml:space="preserve"> (Claude Code, Codex, OpenCode) across model tiers (Opus, Sonnet, GPT Sol, GPT Terra) on the public </w:t>
-      </w:r>
-      <w:r>
-        <w:rPr>
-          <w:b/>
-        </w:rPr>
-        <w:t xml:space="preserve">SWE-bench</w:t>
-      </w:r>
-      <w:r>
-        <w:rPr/>
-        <w:t xml:space="preserve"> framework, orchestrating parallel runs in </w:t>
-      </w:r>
-      <w:r>
-        <w:rPr>
-          <w:b/>
-        </w:rPr>
-        <w:t xml:space="preserve">Docker</w:t>
-      </w:r>
-      <w:r>
-        <w:rPr/>
-        <w:t xml:space="preserve"> with a </w:t>
-      </w:r>
-      <w:r>
-        <w:rPr>
-          <w:b/>
-        </w:rPr>
-        <w:t xml:space="preserve">cost and usage dashboard</w:t>
-      </w:r>
-    </w:p>
-    <w:p>
-      <w:pPr>
-        <w:numPr>
-          <w:ilvl w:val="0"/>
-          <w:numId w:val="3"/>
-        </w:numPr>
-        <w:spacing w:lineRule="auto"/>
-      </w:pPr>
-      <w:r>
-        <w:rPr/>
-        <w:t xml:space="preserve">Built </w:t>
-      </w:r>
-      <w:r>
-        <w:rPr>
-          <w:b/>
-        </w:rPr>
-        <w:t xml:space="preserve">xShifu</w:t>
-      </w:r>
-      <w:r>
-        <w:rPr/>
-        <w:t xml:space="preserve">, a </w:t>
-      </w:r>
-      <w:r>
-        <w:rPr>
-          <w:b/>
-        </w:rPr>
-        <w:t xml:space="preserve">session analytics tool</w:t>
-      </w:r>
-      <w:r>
-        <w:rPr/>
-        <w:t xml:space="preserve"> that analyses developers' local </w:t>
-      </w:r>
-      <w:r>
-        <w:rPr>
-          <w:b/>
-        </w:rPr>
-        <w:t xml:space="preserve">Claude Code and Codex sessions</w:t>
-      </w:r>
-      <w:r>
-        <w:rPr/>
-        <w:t xml:space="preserve"> to surface how they use coding agents, flag wasteful habits and give </w:t>
-      </w:r>
-      <w:r>
-        <w:rPr>
-          <w:b/>
-        </w:rPr>
-        <w:t xml:space="preserve">actionable recommendations to cut token consumption</w:t>
+        <w:t xml:space="preserve">Led a </w:t>
+      </w:r>
+      <w:r>
+        <w:rPr>
+          <w:b/>
+        </w:rPr>
+        <w:t xml:space="preserve">full-backend mission to extract a standalone, reusable microservice</w:t>
+      </w:r>
+      <w:r>
+        <w:rPr/>
+        <w:t xml:space="preserve"> from a legacy </w:t>
+      </w:r>
+      <w:r>
+        <w:rPr>
+          <w:b/>
+        </w:rPr>
+        <w:t xml:space="preserve">KYC</w:t>
+      </w:r>
+      <w:r>
+        <w:rPr/>
+        <w:t xml:space="preserve"> system, consumable across the organization</w:t>
       </w:r>
     </w:p>
     <w:p>
@@ -950,45 +983,19 @@
           <w:color w:val="444444"/>
           <w:sz w:val="18"/>
         </w:rPr>
-        <w:t xml:space="preserve"> Angular, TypeScript, Electron, Node.js, Java 8/11/21, Spring Boot, Quarkus, Keycloak, Oracle DB, MongoDB, SQLite, Karma, Jest, Cypress, Playwright, JaCoCo, Webpack, PowerShell, Jenkins, GitLab CI, Claude, Codex, Agile Scrum</w:t>
-      </w:r>
-    </w:p>
-    <w:p>
-      <w:pPr>
-        <w:spacing w:lineRule="auto"/>
-      </w:pPr>
-      <w:r>
-        <w:rPr>
-          <w:b/>
-          <w:color w:val="000000"/>
-          <w:sz w:val="21"/>
-        </w:rPr>
-        <w:t xml:space="preserve">Full Stack Consultant (Java / React) — ZSOFT CONSULTING</w:t>
-      </w:r>
-      <w:r>
-        <w:rPr>
-          <w:sz w:val="21"/>
-        </w:rPr>
-        <w:br w:type="textWrapping"/>
-      </w:r>
-      <w:r>
-        <w:rPr>
-          <w:color w:val="555555"/>
-          <w:sz w:val="18"/>
-        </w:rPr>
-        <w:t xml:space="preserve">October 2022 – September 2023 (1 year)</w:t>
-      </w:r>
-    </w:p>
-    <w:p>
-      <w:pPr>
-        <w:spacing w:lineRule="auto"/>
-      </w:pPr>
-      <w:r>
-        <w:rPr>
-          <w:b/>
-          <w:sz w:val="20"/>
-        </w:rPr>
-        <w:t xml:space="preserve">Client: Société Générale — Project: KYC</w:t>
+        <w:t xml:space="preserve"> Java 17, Spring Boot, Spring Security, OAuth2, Quartz, RabbitMQ, PostgreSQL, Flyway, JaCoCo, Docker, Kubernetes, Jenkins</w:t>
+      </w:r>
+    </w:p>
+    <w:p>
+      <w:pPr>
+        <w:spacing w:lineRule="auto"/>
+      </w:pPr>
+      <w:r>
+        <w:rPr>
+          <w:b/>
+          <w:sz w:val="20"/>
+        </w:rPr>
+        <w:t xml:space="preserve">Client: Colas — Project: CRM</w:t>
       </w:r>
     </w:p>
     <w:p>
@@ -1001,27 +1008,23 @@
       </w:pPr>
       <w:r>
         <w:rPr/>
-        <w:t xml:space="preserve">Led a </w:t>
-      </w:r>
-      <w:r>
-        <w:rPr>
-          <w:b/>
-        </w:rPr>
-        <w:t xml:space="preserve">full-backend mission to extract a standalone, reusable microservice</w:t>
-      </w:r>
-      <w:r>
-        <w:rPr/>
-        <w:t xml:space="preserve"> from a legacy </w:t>
-      </w:r>
-      <w:r>
-        <w:rPr>
-          <w:b/>
-        </w:rPr>
-        <w:t xml:space="preserve">KYC</w:t>
-      </w:r>
-      <w:r>
-        <w:rPr/>
-        <w:t xml:space="preserve"> system, consumable across the organization</w:t>
+        <w:t xml:space="preserve">Deployed the application on </w:t>
+      </w:r>
+      <w:r>
+        <w:rPr>
+          <w:b/>
+        </w:rPr>
+        <w:t xml:space="preserve">Azure</w:t>
+      </w:r>
+      <w:r>
+        <w:rPr/>
+        <w:t xml:space="preserve"> (App Services, Front Door, CDN, Blob Storage, PostgreSQL) with </w:t>
+      </w:r>
+      <w:r>
+        <w:rPr>
+          <w:b/>
+        </w:rPr>
+        <w:t xml:space="preserve">CI/CD pipelines</w:t>
       </w:r>
     </w:p>
     <w:p>
@@ -1041,19 +1044,19 @@
           <w:color w:val="444444"/>
           <w:sz w:val="18"/>
         </w:rPr>
-        <w:t xml:space="preserve"> Java 17, Spring Boot, Spring Security, OAuth2, Quartz, RabbitMQ, PostgreSQL, Flyway, JaCoCo, Docker, Kubernetes, Jenkins</w:t>
-      </w:r>
-    </w:p>
-    <w:p>
-      <w:pPr>
-        <w:spacing w:lineRule="auto"/>
-      </w:pPr>
-      <w:r>
-        <w:rPr>
-          <w:b/>
-          <w:sz w:val="20"/>
-        </w:rPr>
-        <w:t xml:space="preserve">Client: Colas — Project: CRM</w:t>
+        <w:t xml:space="preserve"> React, TypeScript, Ant Design, Java 11, Spring Boot, Spring Security, Spring Batch, Azure (AD, App Services, CDN, Front Door, Blob Storage, PostgreSQL), GitLab CI/CD</w:t>
+      </w:r>
+    </w:p>
+    <w:p>
+      <w:pPr>
+        <w:spacing w:lineRule="auto"/>
+      </w:pPr>
+      <w:r>
+        <w:rPr>
+          <w:b/>
+          <w:sz w:val="20"/>
+        </w:rPr>
+        <w:t xml:space="preserve">Client: gloody.co — Project: HR &amp; Business Management SaaS</w:t>
       </w:r>
     </w:p>
     <w:p>
@@ -1066,23 +1069,70 @@
       </w:pPr>
       <w:r>
         <w:rPr/>
-        <w:t xml:space="preserve">Deployed the application on </w:t>
-      </w:r>
-      <w:r>
-        <w:rPr>
-          <w:b/>
-        </w:rPr>
-        <w:t xml:space="preserve">Azure</w:t>
-      </w:r>
-      <w:r>
-        <w:rPr/>
-        <w:t xml:space="preserve"> (App Services, Front Door, CDN, Blob Storage, PostgreSQL) with </w:t>
-      </w:r>
-      <w:r>
-        <w:rPr>
-          <w:b/>
-        </w:rPr>
-        <w:t xml:space="preserve">CI/CD pipelines</w:t>
+        <w:t xml:space="preserve">Delivered </w:t>
+      </w:r>
+      <w:r>
+        <w:rPr>
+          <w:b/>
+        </w:rPr>
+        <w:t xml:space="preserve">full-stack features</w:t>
+      </w:r>
+      <w:r>
+        <w:rPr/>
+        <w:t xml:space="preserve"> across the suite — absences &amp; holidays, invoicing, expense reports and meeting booking — with </w:t>
+      </w:r>
+      <w:r>
+        <w:rPr>
+          <w:b/>
+        </w:rPr>
+        <w:t xml:space="preserve">React / Ant Design</w:t>
+      </w:r>
+      <w:r>
+        <w:rPr/>
+        <w:t xml:space="preserve"> front-ends on </w:t>
+      </w:r>
+      <w:r>
+        <w:rPr>
+          <w:b/>
+        </w:rPr>
+        <w:t xml:space="preserve">Java / Spring Boot</w:t>
+      </w:r>
+      <w:r>
+        <w:rPr/>
+        <w:t xml:space="preserve"> REST APIs</w:t>
+      </w:r>
+    </w:p>
+    <w:p>
+      <w:pPr>
+        <w:numPr>
+          <w:ilvl w:val="0"/>
+          <w:numId w:val="5"/>
+        </w:numPr>
+        <w:spacing w:lineRule="auto"/>
+      </w:pPr>
+      <w:r>
+        <w:rPr/>
+        <w:t xml:space="preserve">Owned the </w:t>
+      </w:r>
+      <w:r>
+        <w:rPr>
+          <w:b/>
+        </w:rPr>
+        <w:t xml:space="preserve">front-end architecture</w:t>
+      </w:r>
+      <w:r>
+        <w:rPr/>
+        <w:t xml:space="preserve">, notably a </w:t>
+      </w:r>
+      <w:r>
+        <w:rPr>
+          <w:b/>
+        </w:rPr>
+        <w:t xml:space="preserve">high-performance calendar</w:t>
+      </w:r>
+      <w:r>
+        <w:rPr/>
+        <w:t xml:space="preserve"> rendering dense scheduling data (absences, holidays, room bookings) with smooth navigation</w:t>
       </w:r>
     </w:p>
     <w:p>
@@ -1102,19 +1152,45 @@
           <w:color w:val="444444"/>
           <w:sz w:val="18"/>
         </w:rPr>
-        <w:t xml:space="preserve"> React, TypeScript, Ant Design, Java 11, Spring Boot, Spring Security, Spring Batch, Azure (AD, App Services, CDN, Front Door, Blob Storage, PostgreSQL), GitLab CI/CD</w:t>
-      </w:r>
-    </w:p>
-    <w:p>
-      <w:pPr>
-        <w:spacing w:lineRule="auto"/>
-      </w:pPr>
-      <w:r>
-        <w:rPr>
-          <w:b/>
-          <w:sz w:val="20"/>
-        </w:rPr>
-        <w:t xml:space="preserve">Client: gloody.co — Project: HR &amp; Business Management SaaS</w:t>
+        <w:t xml:space="preserve"> React, TypeScript, Ant Design, SCSS, Java, Spring Boot, REST APIs, AWS</w:t>
+      </w:r>
+    </w:p>
+    <w:p>
+      <w:pPr>
+        <w:spacing w:lineRule="auto"/>
+      </w:pPr>
+      <w:r>
+        <w:rPr>
+          <w:b/>
+          <w:color w:val="000000"/>
+          <w:sz w:val="21"/>
+        </w:rPr>
+        <w:t xml:space="preserve">Full Stack Developer → Project Lead (Java / Angular) — SCOR</w:t>
+      </w:r>
+      <w:r>
+        <w:rPr>
+          <w:sz w:val="21"/>
+        </w:rPr>
+        <w:br w:type="textWrapping"/>
+      </w:r>
+      <w:r>
+        <w:rPr>
+          <w:color w:val="555555"/>
+          <w:sz w:val="18"/>
+        </w:rPr>
+        <w:t xml:space="preserve">June 2019 – September 2022 (3 years 4 months)</w:t>
+      </w:r>
+    </w:p>
+    <w:p>
+      <w:pPr>
+        <w:spacing w:lineRule="auto"/>
+      </w:pPr>
+      <w:r>
+        <w:rPr>
+          <w:b/>
+          <w:sz w:val="20"/>
+        </w:rPr>
+        <w:t xml:space="preserve">Project: RiskReveal</w:t>
       </w:r>
     </w:p>
     <w:p>
@@ -1127,37 +1203,17 @@
       </w:pPr>
       <w:r>
         <w:rPr/>
-        <w:t xml:space="preserve">Delivered </w:t>
-      </w:r>
-      <w:r>
-        <w:rPr>
-          <w:b/>
-        </w:rPr>
-        <w:t xml:space="preserve">full-stack features</w:t>
-      </w:r>
-      <w:r>
-        <w:rPr/>
-        <w:t xml:space="preserve"> across the suite — absences &amp; holidays, invoicing, expense reports and meeting booking — with </w:t>
-      </w:r>
-      <w:r>
-        <w:rPr>
-          <w:b/>
-        </w:rPr>
-        <w:t xml:space="preserve">React / Ant Design</w:t>
-      </w:r>
-      <w:r>
-        <w:rPr/>
-        <w:t xml:space="preserve"> front-ends on </w:t>
-      </w:r>
-      <w:r>
-        <w:rPr>
-          <w:b/>
-        </w:rPr>
-        <w:t xml:space="preserve">Java / Spring Boot</w:t>
-      </w:r>
-      <w:r>
-        <w:rPr/>
-        <w:t xml:space="preserve"> REST APIs</w:t>
+        <w:t xml:space="preserve">Grew from full-stack developer into </w:t>
+      </w:r>
+      <w:r>
+        <w:rPr>
+          <w:b/>
+        </w:rPr>
+        <w:t xml:space="preserve">technical / project lead</w:t>
+      </w:r>
+      <w:r>
+        <w:rPr/>
+        <w:t xml:space="preserve">, validating backend (Spring) delivery and driving implementation across the team</w:t>
       </w:r>
     </w:p>
     <w:p>
@@ -1170,187 +1226,73 @@
       </w:pPr>
       <w:r>
         <w:rPr/>
-        <w:t xml:space="preserve">Owned the </w:t>
-      </w:r>
-      <w:r>
-        <w:rPr>
-          <w:b/>
-        </w:rPr>
-        <w:t xml:space="preserve">front-end architecture</w:t>
-      </w:r>
-      <w:r>
-        <w:rPr/>
-        <w:t xml:space="preserve">, notably a </w:t>
-      </w:r>
-      <w:r>
-        <w:rPr>
-          <w:b/>
-        </w:rPr>
-        <w:t xml:space="preserve">high-performance calendar</w:t>
-      </w:r>
-      <w:r>
-        <w:rPr/>
-        <w:t xml:space="preserve"> rendering dense scheduling data (absences, holidays, room bookings) with smooth navigation</w:t>
-      </w:r>
-    </w:p>
-    <w:p>
-      <w:pPr>
-        <w:spacing w:lineRule="auto"/>
-      </w:pPr>
-      <w:r>
-        <w:rPr>
-          <w:b/>
-          <w:sz w:val="18"/>
-        </w:rPr>
-        <w:t xml:space="preserve">Technical Environment:</w:t>
-      </w:r>
-      <w:r>
-        <w:rPr>
-          <w:rFonts w:ascii="Consolas" w:hAnsi="Consolas"/>
-          <w:color w:val="444444"/>
-          <w:sz w:val="18"/>
-        </w:rPr>
-        <w:t xml:space="preserve"> React, TypeScript, Ant Design, SCSS, Java, Spring Boot, REST APIs, AWS</w:t>
-      </w:r>
-    </w:p>
-    <w:p>
-      <w:pPr>
-        <w:spacing w:lineRule="auto"/>
-      </w:pPr>
-      <w:r>
-        <w:rPr>
-          <w:b/>
-          <w:color w:val="000000"/>
-          <w:sz w:val="21"/>
-        </w:rPr>
-        <w:t xml:space="preserve">Full Stack Developer → Project Lead (Java / Angular) — SCOR</w:t>
-      </w:r>
-      <w:r>
-        <w:rPr>
-          <w:sz w:val="21"/>
-        </w:rPr>
-        <w:br w:type="textWrapping"/>
-      </w:r>
-      <w:r>
-        <w:rPr>
-          <w:color w:val="555555"/>
-          <w:sz w:val="18"/>
-        </w:rPr>
-        <w:t xml:space="preserve">June 2019 – September 2022 (3 years 4 months)</w:t>
-      </w:r>
-    </w:p>
-    <w:p>
-      <w:pPr>
-        <w:spacing w:lineRule="auto"/>
-      </w:pPr>
-      <w:r>
-        <w:rPr>
-          <w:b/>
-          <w:sz w:val="20"/>
-        </w:rPr>
-        <w:t xml:space="preserve">Project: RiskReveal</w:t>
+        <w:t xml:space="preserve">Built the </w:t>
+      </w:r>
+      <w:r>
+        <w:rPr>
+          <w:b/>
+        </w:rPr>
+        <w:t xml:space="preserve">data-heavy risk UI</w:t>
+      </w:r>
+      <w:r>
+        <w:rPr/>
+        <w:t xml:space="preserve"> on </w:t>
+      </w:r>
+      <w:r>
+        <w:rPr>
+          <w:b/>
+        </w:rPr>
+        <w:t xml:space="preserve">AG Grid</w:t>
+      </w:r>
+      <w:r>
+        <w:rPr/>
+        <w:t xml:space="preserve"> — virtualised grids, grouping and aggregation over large </w:t>
+      </w:r>
+      <w:r>
+        <w:rPr>
+          <w:b/>
+        </w:rPr>
+        <w:t xml:space="preserve">PLT loss datasets</w:t>
       </w:r>
     </w:p>
     <w:p>
       <w:pPr>
         <w:numPr>
           <w:ilvl w:val="0"/>
-          <w:numId w:val="7"/>
+          <w:numId w:val="6"/>
         </w:numPr>
         <w:spacing w:lineRule="auto"/>
       </w:pPr>
       <w:r>
         <w:rPr/>
-        <w:t xml:space="preserve">Grew from full-stack developer into </w:t>
-      </w:r>
-      <w:r>
-        <w:rPr>
-          <w:b/>
-        </w:rPr>
-        <w:t xml:space="preserve">technical / project lead</w:t>
-      </w:r>
-      <w:r>
-        <w:rPr/>
-        <w:t xml:space="preserve">, validating backend (Spring) delivery and driving implementation across the team</w:t>
+        <w:t xml:space="preserve">Optimized and evolved the </w:t>
+      </w:r>
+      <w:r>
+        <w:rPr>
+          <w:b/>
+        </w:rPr>
+        <w:t xml:space="preserve">batch orchestration system</w:t>
+      </w:r>
+      <w:r>
+        <w:rPr/>
+        <w:t xml:space="preserve"> (Spring Batch) on large-volume risk data, with </w:t>
+      </w:r>
+      <w:r>
+        <w:rPr>
+          <w:b/>
+        </w:rPr>
+        <w:t xml:space="preserve">WebSockets</w:t>
+      </w:r>
+      <w:r>
+        <w:rPr/>
+        <w:t xml:space="preserve"> for real-time job progress</w:t>
       </w:r>
     </w:p>
     <w:p>
       <w:pPr>
         <w:numPr>
           <w:ilvl w:val="0"/>
-          <w:numId w:val="7"/>
-        </w:numPr>
-        <w:spacing w:lineRule="auto"/>
-      </w:pPr>
-      <w:r>
-        <w:rPr/>
-        <w:t xml:space="preserve">Built the </w:t>
-      </w:r>
-      <w:r>
-        <w:rPr>
-          <w:b/>
-        </w:rPr>
-        <w:t xml:space="preserve">data-heavy risk UI</w:t>
-      </w:r>
-      <w:r>
-        <w:rPr/>
-        <w:t xml:space="preserve"> on </w:t>
-      </w:r>
-      <w:r>
-        <w:rPr>
-          <w:b/>
-        </w:rPr>
-        <w:t xml:space="preserve">AG Grid</w:t>
-      </w:r>
-      <w:r>
-        <w:rPr/>
-        <w:t xml:space="preserve"> — virtualised grids, grouping and aggregation over large </w:t>
-      </w:r>
-      <w:r>
-        <w:rPr>
-          <w:b/>
-        </w:rPr>
-        <w:t xml:space="preserve">PLT loss datasets</w:t>
-      </w:r>
-    </w:p>
-    <w:p>
-      <w:pPr>
-        <w:numPr>
-          <w:ilvl w:val="0"/>
-          <w:numId w:val="7"/>
-        </w:numPr>
-        <w:spacing w:lineRule="auto"/>
-      </w:pPr>
-      <w:r>
-        <w:rPr/>
-        <w:t xml:space="preserve">Optimized and evolved the </w:t>
-      </w:r>
-      <w:r>
-        <w:rPr>
-          <w:b/>
-        </w:rPr>
-        <w:t xml:space="preserve">batch orchestration system</w:t>
-      </w:r>
-      <w:r>
-        <w:rPr/>
-        <w:t xml:space="preserve"> (Spring Batch) on large-volume risk data, with </w:t>
-      </w:r>
-      <w:r>
-        <w:rPr>
-          <w:b/>
-        </w:rPr>
-        <w:t xml:space="preserve">WebSockets</w:t>
-      </w:r>
-      <w:r>
-        <w:rPr/>
-        <w:t xml:space="preserve"> for real-time job progress</w:t>
-      </w:r>
-    </w:p>
-    <w:p>
-      <w:pPr>
-        <w:numPr>
-          <w:ilvl w:val="0"/>
-          <w:numId w:val="7"/>
+          <w:numId w:val="6"/>
         </w:numPr>
         <w:spacing w:lineRule="auto"/>
       </w:pPr>
@@ -2233,128 +2175,6 @@
     </w:lvl>
   </w:abstractNum>
   <w:abstractNum w:abstractNumId="6">
-    <w:lvl w:ilvl="0">
-      <w:start w:val="1"/>
-      <w:numFmt w:val="bullet"/>
-      <w:lvlText w:val=""/>
-      <w:lvlJc w:val="left"/>
-      <w:pPr>
-        <w:tabs>
-          <w:tab w:val="num" w:pos="720"/>
-        </w:tabs>
-        <w:ind w:left="720" w:hanging="360"/>
-      </w:pPr>
-      <w:rPr>
-        <w:rFonts w:ascii="Symbol" w:hAnsi="Symbol" w:hint="default"/>
-      </w:rPr>
-    </w:lvl>
-    <w:lvl w:ilvl="1">
-      <w:start w:val="1"/>
-      <w:numFmt w:val="bullet"/>
-      <w:lvlText w:val=""/>
-      <w:lvlJc w:val="left"/>
-      <w:pPr>
-        <w:tabs>
-          <w:tab w:val="num" w:pos="1440"/>
-        </w:tabs>
-        <w:ind w:left="1440" w:hanging="360"/>
-      </w:pPr>
-      <w:rPr>
-        <w:rFonts w:ascii="Symbol" w:hAnsi="Symbol" w:hint="default"/>
-      </w:rPr>
-    </w:lvl>
-    <w:lvl w:ilvl="2">
-      <w:start w:val="1"/>
-      <w:numFmt w:val="bullet"/>
-      <w:lvlText w:val=""/>
-      <w:lvlJc w:val="left"/>
-      <w:pPr>
-        <w:tabs>
-          <w:tab w:val="num" w:pos="2160"/>
-        </w:tabs>
-        <w:ind w:left="2160" w:hanging="360"/>
-      </w:pPr>
-      <w:rPr>
-        <w:rFonts w:ascii="Symbol" w:hAnsi="Symbol" w:hint="default"/>
-      </w:rPr>
-    </w:lvl>
-    <w:lvl w:ilvl="3">
-      <w:start w:val="1"/>
-      <w:numFmt w:val="bullet"/>
-      <w:lvlText w:val=""/>
-      <w:lvlJc w:val="left"/>
-      <w:pPr>
-        <w:tabs>
-          <w:tab w:val="num" w:pos="2880"/>
-        </w:tabs>
-        <w:ind w:left="2880" w:hanging="360"/>
-      </w:pPr>
-      <w:rPr>
-        <w:rFonts w:ascii="Symbol" w:hAnsi="Symbol" w:hint="default"/>
-      </w:rPr>
-    </w:lvl>
-    <w:lvl w:ilvl="4">
-      <w:start w:val="1"/>
-      <w:numFmt w:val="bullet"/>
-      <w:lvlText w:val=""/>
-      <w:lvlJc w:val="left"/>
-      <w:pPr>
-        <w:tabs>
-          <w:tab w:val="num" w:pos="3600"/>
-        </w:tabs>
-        <w:ind w:left="3600" w:hanging="360"/>
-      </w:pPr>
-      <w:rPr>
-        <w:rFonts w:ascii="Symbol" w:hAnsi="Symbol" w:hint="default"/>
-      </w:rPr>
-    </w:lvl>
-    <w:lvl w:ilvl="5">
-      <w:start w:val="1"/>
-      <w:numFmt w:val="bullet"/>
-      <w:lvlText w:val=""/>
-      <w:lvlJc w:val="left"/>
-      <w:pPr>
-        <w:tabs>
-          <w:tab w:val="num" w:pos="4320"/>
-        </w:tabs>
-        <w:ind w:left="4320" w:hanging="360"/>
-      </w:pPr>
-      <w:rPr>
-        <w:rFonts w:ascii="Symbol" w:hAnsi="Symbol" w:hint="default"/>
-      </w:rPr>
-    </w:lvl>
-    <w:lvl w:ilvl="6">
-      <w:start w:val="1"/>
-      <w:numFmt w:val="bullet"/>
-      <w:lvlText w:val=""/>
-      <w:lvlJc w:val="left"/>
-      <w:pPr>
-        <w:tabs>
-          <w:tab w:val="num" w:pos="5040"/>
-        </w:tabs>
-        <w:ind w:left="5040" w:hanging="360"/>
-      </w:pPr>
-      <w:rPr>
-        <w:rFonts w:ascii="Symbol" w:hAnsi="Symbol" w:hint="default"/>
-      </w:rPr>
-    </w:lvl>
-    <w:lvl w:ilvl="7">
-      <w:start w:val="1"/>
-      <w:numFmt w:val="bullet"/>
-      <w:lvlText w:val=""/>
-      <w:lvlJc w:val="left"/>
-      <w:pPr>
-        <w:tabs>
-          <w:tab w:val="num" w:pos="5760"/>
-        </w:tabs>
-        <w:ind w:left="5760" w:hanging="360"/>
-      </w:pPr>
-      <w:rPr>
-        <w:rFonts w:ascii="Symbol" w:hAnsi="Symbol" w:hint="default"/>
-      </w:rPr>
-    </w:lvl>
-  </w:abstractNum>
-  <w:abstractNum w:abstractNumId="7">
     <w:lvl w:ilvl="0">
       <w:start w:val="1"/>
       <w:numFmt w:val="bullet"/>
@@ -2493,9 +2313,6 @@
   </w:num>
   <w:num w:numId="6">
     <w:abstractNumId w:val="6"/>
-  </w:num>
-  <w:num w:numId="7">
-    <w:abstractNumId w:val="7"/>
   </w:num>
 </w:numbering>
 </file>

</xml_diff>